<commit_message>
Criação do Arquivo de Atualizações
</commit_message>
<xml_diff>
--- a/Gestão de Riscos.docx
+++ b/Gestão de Riscos.docx
@@ -23,7 +23,7 @@
         <w:pStyle w:val="Subtitle"/>
       </w:pPr>
       <w:r>
-        <w:t xml:space="preserve">Análise do projeto e plano de acompanhamento</w:t>
+        <w:t xml:space="preserve">Cenários potenciais e plano preventivo de acompanhamento</w:t>
       </w:r>
     </w:p>
     <w:p>
@@ -31,7 +31,7 @@
         <w:pStyle w:val="Meta"/>
       </w:pPr>
       <w:r>
-        <w:t xml:space="preserve">Versão 1.0  •  21 de setembro de 2026</w:t>
+        <w:t xml:space="preserve">Versão 1.1 • 22 de setembro de 2026</w:t>
       </w:r>
     </w:p>
     <w:p>
@@ -47,7 +47,7 @@
         <w:pStyle w:val="Normal"/>
       </w:pPr>
       <w:r>
-        <w:t xml:space="preserve">Identificar ameaças à entrega, à operação e à evolução do BarberApp, avaliar sua prioridade e recomendar respostas verificáveis. A análise considera frontend HTML/CSS/JavaScript, API Node.js/Express, PostgreSQL, testes, documentação, dependências e publicação.</w:t>
+        <w:t xml:space="preserve">Identificar eventos que poderão afetar a entrega, a operação e a evolução futura do BarberApp e propor medidas de prevenção, resposta e acompanhamento. O escopo abrange implantação, dados, segurança, agenda, experiência do usuário e manutenção.</w:t>
       </w:r>
     </w:p>
     <w:p>
@@ -55,7 +55,7 @@
         <w:pStyle w:val="Normal"/>
       </w:pPr>
       <w:r>
-        <w:t xml:space="preserve">Foram examinados os arquivos do projeto disponíveis no diretório de trabalho, incluindo arquivos ocultos de configuração e a imagem local. O apêndice apresenta o inventário. Metadados internos do Git e código de dependências de terceiros não integram a revisão do sistema; as dependências foram examinadas pelo manifesto e lockfile.</w:t>
+        <w:t xml:space="preserve">A análise é prospectiva e independente da implementação atual. Considera possibilidades para a futura solução, cuja arquitetura, infraestrutura e processos serão definidos antes da publicação. Os cenários descritos não constituem constatações de falhas no código ou no ambiente existente.</w:t>
       </w:r>
     </w:p>
     <w:p>
@@ -71,7 +71,7 @@
         <w:pStyle w:val="Normal"/>
       </w:pPr>
       <w:r>
-        <w:t xml:space="preserve">A prioridade é garantir uma publicação funcional e validar a operação com dados reais: hospedagem da API, restauração de backups, proteção de sessões, regras da fila e testes obrigatórios antes do deploy. Há controles importantes já implementados, especialmente autorização no servidor, consultas SQL parametrizadas, hashing de senhas e transações para conflitos de agenda.</w:t>
+        <w:t xml:space="preserve">O planejamento preventivo prioriza disponibilidade da aplicação, recuperação de dados, proteção de sessões, consistência da fila e validação das entregas. Os 18 riscos representam eventos possíveis; sua aplicabilidade e prioridade deverão ser confirmadas conforme as decisões da futura implantação.</w:t>
       </w:r>
     </w:p>
     <w:tbl>
@@ -120,7 +120,7 @@
                 <w:b/>
                 <w:color w:val="FFFFFF"/>
               </w:rPr>
-              <w:t>Riscos avaliados</w:t>
+              <w:t>Riscos potenciais</w:t>
             </w:r>
           </w:p>
         </w:tc>
@@ -305,7 +305,7 @@
         <w:pStyle w:val="Normal"/>
       </w:pPr>
       <w:r>
-        <w:t xml:space="preserve">Os níveis são estimativas qualitativas baseadas no código e na configuração disponíveis, considerando os controles atuais. Não representam frequência medida de incidentes. Ausência de um controle no repositório não comprova ausência na infraestrutura externa. Não houve auditoria de produção, teste de invasão, teste de carga ou verificação de conformidade jurídica.</w:t>
+        <w:t xml:space="preserve">As notas são estimativas qualitativas preliminares para os cenários hipotéticos descritos, sem inferência sobre o código atual ou frequência medida de incidentes. A distribuição de níveis é uma referência de planejamento e deverá ser revista conforme arquitetura, exposição, volume de uso e eficácia dos controles da versão final.</w:t>
       </w:r>
     </w:p>
     <w:p>
@@ -313,7 +313,7 @@
         <w:pStyle w:val="Normal"/>
       </w:pPr>
       <w:r>
-        <w:t xml:space="preserve">Validação executada: npm.cmd test — 2 testes de segurança aprovados, 0 falhas e 1 teste de integração ignorado por falta de TEST_DATABASE_URL. As regras dependentes do PostgreSQL foram analisadas por leitura, sem execução de integração. Nenhum código funcional foi alterado para produzir este documento.</w:t>
+        <w:t xml:space="preserve">Validação prevista: antes da implantação, reunir resultados de homologação, testes de segurança, carga, integração e recuperação, conforme aplicáveis. Resultados de testes da implementação atual não fundamentam esta avaliação.</w:t>
       </w:r>
     </w:p>
     <w:p>
@@ -334,7 +334,7 @@
         <w:pStyle w:val="Normal"/>
       </w:pPr>
       <w:r>
-        <w:t xml:space="preserve">Cada risco recebe probabilidade (P) e impacto (I) de 1 a 5. O escore é P × I, entre 1 e 25. O nível final solicitado, de 1 a 5, é obtido pela conversão abaixo. O horizonte considerado é a próxima implantação e os primeiros 90 dias de operação ou evolução.</w:t>
+        <w:t xml:space="preserve">Cada risco recebe probabilidade (P) e impacto (I) de 1 a 5. O escore P × I varia de 1 a 25 e é convertido em nível conforme a tabela. As notas são hipóteses iniciais para a futura implantação e seus primeiros 90 dias de operação, a confirmar quando o ambiente e os controles forem definidos.</w:t>
       </w:r>
     </w:p>
     <w:tbl>
@@ -514,7 +514,7 @@
               <w:rPr>
                 <w:sz w:val="18"/>
               </w:rPr>
-              <w:t>Improvável: controles reduzem a ocorrência.</w:t>
+              <w:t>Improvável: ocorrência pouco esperada nas condições pressupostas.</w:t>
             </w:r>
           </w:p>
         </w:tc>
@@ -626,7 +626,7 @@
               <w:rPr>
                 <w:sz w:val="18"/>
               </w:rPr>
-              <w:t>Provável: lacuna tende a afetar fluxos comuns.</w:t>
+              <w:t>Provável: ocorrência esperada se as condições do cenário se mantiverem.</w:t>
             </w:r>
           </w:p>
         </w:tc>
@@ -1191,7 +1191,7 @@
         <w:pStyle w:val="Normal"/>
       </w:pPr>
       <w:r>
-        <w:t xml:space="preserve">Exemplo: R01 tem P = 5 e I = 4; escore = 20; nível = 5 (Crítico). A probabilidade considera a publicação pelo workflow atual sem API configurada. Se já existir uma infraestrutura externa funcional, esse risco deve ser reavaliado.</w:t>
+        <w:t xml:space="preserve">Exemplo hipotético: se uma publicação disponibilizar a interface sem os serviços necessários às operações, R01 poderá receber P = 5 e I = 4, resultando em escore 20 e nível 5. Essa nota é condicionada ao cenário e não estima a probabilidade de a futura equipe adotar essa configuração. Reavaliar todas as notas diante do plano efetivo de implantação.</w:t>
       </w:r>
     </w:p>
     <w:p>
@@ -1207,7 +1207,7 @@
         <w:pStyle w:val="Normal"/>
       </w:pPr>
       <w:r>
-        <w:t xml:space="preserve">Todos os riscos iniciam como “Aberto — tratamento proposto”. Responsáveis são papéis sugeridos, a serem atribuídos a pessoas pela gestão. Prazos e limiares de alerta são propostas iniciais, não compromissos já aprovados. Recalcular o risco residual após implementar e comprovar os controles; não considerar redução de nível apenas pelo planejamento da ação.</w:t>
+        <w:t xml:space="preserve">Todos os riscos iniciam como “Potencial — a validar”. Responsáveis são papéis sugeridos, a serem atribuídos pela gestão. Prazos e limiares são propostas. Confirmar aplicabilidade, probabilidade, impacto e controles na versão a implantar; registrar risco residual somente após verificar a eficácia das medidas adotadas.</w:t>
       </w:r>
     </w:p>
     <w:p>
@@ -1228,7 +1228,7 @@
         <w:pStyle w:val="Normal"/>
       </w:pPr>
       <w:r>
-        <w:t xml:space="preserve">P = probabilidade; I = impacto. Os detalhes de evidência, resposta, contingência e monitoramento constam na seção seguinte.</w:t>
+        <w:t xml:space="preserve">P = probabilidade; I = impacto. Notas preliminares e condicionadas aos cenários. Os detalhes de cenário potencial, prevenção, resposta e monitoramento constam na seção seguinte.</w:t>
       </w:r>
     </w:p>
     <w:tbl>
@@ -3318,7 +3318,7 @@
         <w:pStyle w:val="Normal"/>
       </w:pPr>
       <w:r>
-        <w:t xml:space="preserve">R01 depende da forma de hospedagem; validar primeiro. R02, R03, R05 e R07 exigem atenção antes de operar publicamente com dados reais. Riscos moderados e baixos permanecem no plano, com acompanhamento e tratamento proporcional. A ordem dentro de um mesmo nível considera dependências e impacto no atendimento.</w:t>
+        <w:t xml:space="preserve">Como referência preliminar, validar a integração da hospedagem (R01) e planejar recuperação de dados (R02), proteção de sessões (R03), consistência da fila (R05) e validação das entregas (R07). A ordem de tratamento dependerá da exposição e dos controles efetivamente previstos. Os demais riscos terão acompanhamento proporcional à avaliação revisada.</w:t>
       </w:r>
     </w:p>
     <w:p>
@@ -3364,24 +3364,24 @@
         <w:rPr>
           <w:b/>
         </w:rPr>
-        <w:t xml:space="preserve">Evidência e análise: </w:t>
-      </w:r>
-      <w:r>
-        <w:t xml:space="preserve">Constatado na configuração; efeito condicionado ao uso do GitHub Pages. O workflow publica somente BarberApp/BarberApp e config.js aponta para /api. Sem um servidor separado configurado, o site abre, mas login, cadastros e reservas não funcionam. Não foi verificada uma implantação externa.</w:t>
-      </w:r>
-    </w:p>
-    <w:p>
-      <w:pPr>
-        <w:pStyle w:val="Detail"/>
-      </w:pPr>
-      <w:r>
-        <w:rPr>
-          <w:b/>
-        </w:rPr>
-        <w:t xml:space="preserve">Controles existentes: </w:t>
-      </w:r>
-      <w:r>
-        <w:t xml:space="preserve">Há servidor Node.js e instruções para hospedagem conjunta ou separada.</w:t>
+        <w:t xml:space="preserve">Cenário potencial: Se a interface for publicada com serviços indisponíveis ou integração incorreta, usuários poderão acessar as páginas sem conseguir autenticar, cadastrar ou reservar.</w:t>
+      </w:r>
+      <w:r>
+        <w:t xml:space="preserve"/>
+      </w:r>
+    </w:p>
+    <w:p>
+      <w:pPr>
+        <w:pStyle w:val="Detail"/>
+      </w:pPr>
+      <w:r>
+        <w:rPr>
+          <w:b/>
+        </w:rPr>
+        <w:t xml:space="preserve">Controles preventivos a considerar: Validar a arquitetura de hospedagem, conectividade e configuração entre interface, serviços e banco antes da liberação.</w:t>
+      </w:r>
+      <w:r>
+        <w:t xml:space="preserve"/>
       </w:r>
     </w:p>
     <w:p>
@@ -3448,10 +3448,10 @@
         <w:rPr>
           <w:b/>
         </w:rPr>
-        <w:t xml:space="preserve">Referências locais: </w:t>
-      </w:r>
-      <w:r>
-        <w:t xml:space="preserve">.github/workflows/deploy.yml; js/config.js; backend/server.js; backend/README.md.</w:t>
+        <w:t xml:space="preserve">Validação futura: verificar o cenário e a eficácia dos controles no ambiente de homologação e registrar os resultados antes de confirmar a classificação.</w:t>
+      </w:r>
+      <w:r>
+        <w:t xml:space="preserve"/>
       </w:r>
     </w:p>
     <w:p>
@@ -3484,24 +3484,24 @@
         <w:rPr>
           <w:b/>
         </w:rPr>
-        <w:t xml:space="preserve">Evidência e análise: </w:t>
-      </w:r>
-      <w:r>
-        <w:t xml:space="preserve">Ausência de evidência no repositório; infraestrutura externa não avaliada. Não foram encontrados rotinas de backup, retenção ou ensaios de restauração. Falha do banco ou exclusão acidental pode comprometer agenda, usuários e histórico de serviços.</w:t>
-      </w:r>
-    </w:p>
-    <w:p>
-      <w:pPr>
-        <w:pStyle w:val="Detail"/>
-      </w:pPr>
-      <w:r>
-        <w:rPr>
-          <w:b/>
-        </w:rPr>
-        <w:t xml:space="preserve">Controles existentes: </w:t>
-      </w:r>
-      <w:r>
-        <w:t xml:space="preserve">Transações e chaves estrangeiras preservam consistência, mas não substituem cópias recuperáveis.</w:t>
+        <w:t xml:space="preserve">Cenário potencial: Falhas de infraestrutura, exclusões acidentais ou cópias inutilizáveis poderão causar perda de agenda e histórico caso a recuperação não seja eficaz.</w:t>
+      </w:r>
+      <w:r>
+        <w:t xml:space="preserve"/>
+      </w:r>
+    </w:p>
+    <w:p>
+      <w:pPr>
+        <w:pStyle w:val="Detail"/>
+      </w:pPr>
+      <w:r>
+        <w:rPr>
+          <w:b/>
+        </w:rPr>
+        <w:t xml:space="preserve">Controles preventivos a considerar: Planejar cópias protegidas, retenção, testes de restauração e mecanismos de consistência dos dados.</w:t>
+      </w:r>
+      <w:r>
+        <w:t xml:space="preserve"/>
       </w:r>
     </w:p>
     <w:p>
@@ -3568,10 +3568,10 @@
         <w:rPr>
           <w:b/>
         </w:rPr>
-        <w:t xml:space="preserve">Referências locais: </w:t>
-      </w:r>
-      <w:r>
-        <w:t xml:space="preserve">backend/db.js; backend/schema.sql; backend/README.md; inventário do repositório.</w:t>
+        <w:t xml:space="preserve">Validação futura: verificar o cenário e a eficácia dos controles no ambiente de homologação e registrar os resultados antes de confirmar a classificação.</w:t>
+      </w:r>
+      <w:r>
+        <w:t xml:space="preserve"/>
       </w:r>
     </w:p>
     <w:p>
@@ -3617,24 +3617,144 @@
         <w:rPr>
           <w:b/>
         </w:rPr>
-        <w:t xml:space="preserve">Evidência e análise: </w:t>
-      </w:r>
-      <w:r>
-        <w:t xml:space="preserve">Exposição potencial identificada; exploração não demonstrada. O token fica no localStorage e a sessão dura sete dias. Um script malicioso executado na mesma origem poderia ler o token e agir como o usuário, inclusive como administrador. Não há CSP definida pela aplicação.</w:t>
-      </w:r>
-    </w:p>
-    <w:p>
-      <w:pPr>
-        <w:pStyle w:val="Detail"/>
-      </w:pPr>
-      <w:r>
-        <w:rPr>
-          <w:b/>
-        </w:rPr>
-        <w:t xml:space="preserve">Controles existentes: </w:t>
-      </w:r>
-      <w:r>
-        <w:t xml:space="preserve">Senhas scrypt com salt; token aleatório e hash no banco; escapeHTML; validação de fotos; autorização no backend. Nenhuma falha de XSS foi comprovada nesta revisão.</w:t>
+        <w:t xml:space="preserve">Cenário potencial: Se credenciais ou tokens de sessão forem expostos por scripts, dispositivos comprometidos ou comunicação inadequada, terceiros poderão agir em nome de usuários.</w:t>
+      </w:r>
+      <w:r>
+        <w:t xml:space="preserve"/>
+      </w:r>
+    </w:p>
+    <w:p>
+      <w:pPr>
+        <w:pStyle w:val="Detail"/>
+      </w:pPr>
+      <w:r>
+        <w:rPr>
+          <w:b/>
+        </w:rPr>
+        <w:t xml:space="preserve">Controles preventivos a considerar: Prever proteção de credenciais, armazenamento seguro de sessões, expiração, revogação e autorização por operação.</w:t>
+      </w:r>
+      <w:r>
+        <w:t xml:space="preserve"/>
+      </w:r>
+    </w:p>
+    <w:p>
+      <w:pPr>
+        <w:pStyle w:val="Detail"/>
+      </w:pPr>
+      <w:r>
+        <w:rPr>
+          <w:b/>
+        </w:rPr>
+        <w:t xml:space="preserve">Resposta recomendada: Mitigar: definir armazenamento e duração adequados das sessões, avaliar cookies protegidos e proteção contra requisições indevidas conforme a arquitetura, adotar política de conteúdo e permitir revogação de sessões. Validar transporte seguro na hospedagem.</w:t>
+      </w:r>
+      <w:r>
+        <w:t xml:space="preserve"/>
+      </w:r>
+    </w:p>
+    <w:p>
+      <w:pPr>
+        <w:pStyle w:val="Detail"/>
+      </w:pPr>
+      <w:r>
+        <w:rPr>
+          <w:b/>
+        </w:rPr>
+        <w:t xml:space="preserve">Contingência: </w:t>
+      </w:r>
+      <w:r>
+        <w:t xml:space="preserve">Revogar sessões afetadas, conter a origem do script e revisar operações realizadas durante a exposição.</w:t>
+      </w:r>
+    </w:p>
+    <w:p>
+      <w:pPr>
+        <w:pStyle w:val="Detail"/>
+      </w:pPr>
+      <w:r>
+        <w:rPr>
+          <w:b/>
+        </w:rPr>
+        <w:t xml:space="preserve">Monitoramento e gatilho: </w:t>
+      </w:r>
+      <w:r>
+        <w:t xml:space="preserve">A cada versão: revisar inserções HTML e cabeçalhos. Diariamente: investigar ações administrativas inesperadas. Qualquer execução de script não autorizado ou sessão indevida exige contenção imediata.</w:t>
+      </w:r>
+    </w:p>
+    <w:p>
+      <w:pPr>
+        <w:pStyle w:val="Detail"/>
+      </w:pPr>
+      <w:r>
+        <w:rPr>
+          <w:b/>
+        </w:rPr>
+        <w:t xml:space="preserve">Responsável / prazo: </w:t>
+      </w:r>
+      <w:r>
+        <w:t xml:space="preserve">Desenvolvimento e responsável por segurança / Antes de uso público.</w:t>
+      </w:r>
+    </w:p>
+    <w:p>
+      <w:pPr>
+        <w:pStyle w:val="Detail"/>
+      </w:pPr>
+      <w:r>
+        <w:rPr>
+          <w:b/>
+        </w:rPr>
+        <w:t xml:space="preserve">Validação futura: verificar o cenário e a eficácia dos controles no ambiente de homologação e registrar os resultados antes de confirmar a classificação.</w:t>
+      </w:r>
+      <w:r>
+        <w:t xml:space="preserve"/>
+      </w:r>
+    </w:p>
+    <w:p>
+      <w:pPr>
+        <w:pStyle w:val="Heading2"/>
+      </w:pPr>
+      <w:r>
+        <w:t xml:space="preserve">R04 • Bloqueio coletivo e abuso na autenticação</w:t>
+      </w:r>
+    </w:p>
+    <w:p>
+      <w:pPr>
+        <w:pStyle w:val="Detail"/>
+      </w:pPr>
+      <w:r>
+        <w:rPr>
+          <w:b/>
+        </w:rPr>
+        <w:t xml:space="preserve">Classificação: </w:t>
+      </w:r>
+      <w:r>
+        <w:t xml:space="preserve">Segurança e disponibilidade | P 4 × I 3 = 12 | Nível 3/5 — Moderado.</w:t>
+      </w:r>
+    </w:p>
+    <w:p>
+      <w:pPr>
+        <w:pStyle w:val="Detail"/>
+      </w:pPr>
+      <w:r>
+        <w:rPr>
+          <w:b/>
+        </w:rPr>
+        <w:t xml:space="preserve">Cenário potencial: Se os limites de autenticação não considerarem redes compartilhadas e múltiplas instâncias, poderão bloquear usuários legítimos ou permitir tentativas abusivas.</w:t>
+      </w:r>
+      <w:r>
+        <w:t xml:space="preserve"/>
+      </w:r>
+    </w:p>
+    <w:p>
+      <w:pPr>
+        <w:pStyle w:val="Detail"/>
+      </w:pPr>
+      <w:r>
+        <w:rPr>
+          <w:b/>
+        </w:rPr>
+        <w:t xml:space="preserve">Controles preventivos a considerar: Planejar limites por conta e origem, identificação confiável de clientes e proteção adicional de contas privilegiadas.</w:t>
+      </w:r>
+      <w:r>
+        <w:t xml:space="preserve"/>
       </w:r>
     </w:p>
     <w:p>
@@ -3648,7 +3768,7 @@
         <w:t xml:space="preserve">Resposta recomendada: </w:t>
       </w:r>
       <w:r>
-        <w:t xml:space="preserve">Mitigar: reduzir exposição da sessão, avaliar cookie HttpOnly/Secure/SameSite com proteção CSRF, definir CSP compatível com os scripts existentes e permitir revogação de todas as sessões. Verificar HTTPS na hospedagem.</w:t>
+        <w:t xml:space="preserve">Mitigar: identificar IP apenas por proxies confiáveis, combinar limite por conta/IP em armazenamento compartilhado, reforçar política de senhas e proteção de administradores.</w:t>
       </w:r>
     </w:p>
     <w:p>
@@ -3662,7 +3782,7 @@
         <w:t xml:space="preserve">Contingência: </w:t>
       </w:r>
       <w:r>
-        <w:t xml:space="preserve">Revogar sessões afetadas, conter a origem do script e revisar operações realizadas durante a exposição.</w:t>
+        <w:t xml:space="preserve">Revisar bloqueios indevidos sem desligar toda a proteção; revogar sessões caso haja conta comprometida.</w:t>
       </w:r>
     </w:p>
     <w:p>
@@ -3676,7 +3796,7 @@
         <w:t xml:space="preserve">Monitoramento e gatilho: </w:t>
       </w:r>
       <w:r>
-        <w:t xml:space="preserve">A cada versão: revisar inserções HTML e cabeçalhos. Diariamente: investigar ações administrativas inesperadas. Qualquer execução de script não autorizado ou sessão indevida exige contenção imediata.</w:t>
+        <w:t xml:space="preserve">Diariamente: taxa de 429 e falhas por conta/origem. Alertar se mais de 5% dos logins forem bloqueados em 15 minutos; testar dois clientes atrás do mesmo proxy a cada mudança de infraestrutura.</w:t>
       </w:r>
     </w:p>
     <w:p>
@@ -3690,21 +3810,34 @@
         <w:t xml:space="preserve">Responsável / prazo: </w:t>
       </w:r>
       <w:r>
-        <w:t xml:space="preserve">Desenvolvimento e responsável por segurança / Antes de uso público.</w:t>
-      </w:r>
-    </w:p>
-    <w:p>
-      <w:pPr>
-        <w:pStyle w:val="Detail"/>
-      </w:pPr>
-      <w:r>
-        <w:rPr>
-          <w:b/>
-        </w:rPr>
-        <w:t xml:space="preserve">Referências locais: </w:t>
-      </w:r>
-      <w:r>
-        <w:t xml:space="preserve">js/api.js: getToken/setToken; backend/security.js: session; backend/schema.sql: sessoes; backend/app.js.</w:t>
+        <w:t xml:space="preserve">Backend e infraestrutura / Antes da hospedagem atrás de proxy.</w:t>
+      </w:r>
+    </w:p>
+    <w:p>
+      <w:pPr>
+        <w:pStyle w:val="Detail"/>
+      </w:pPr>
+      <w:r>
+        <w:rPr>
+          <w:b/>
+        </w:rPr>
+        <w:t xml:space="preserve">Validação futura: verificar o cenário e a eficácia dos controles no ambiente de homologação e registrar os resultados antes de confirmar a classificação.</w:t>
+      </w:r>
+      <w:r>
+        <w:t xml:space="preserve"/>
+      </w:r>
+    </w:p>
+    <w:p>
+      <w:r>
+        <w:br w:type="page"/>
+      </w:r>
+    </w:p>
+    <w:p>
+      <w:pPr>
+        <w:pStyle w:val="Heading1"/>
+      </w:pPr>
+      <w:r>
+        <w:t xml:space="preserve">5. Análise e resposta por risco — continuação</w:t>
       </w:r>
     </w:p>
     <w:p>
@@ -3712,7 +3845,7 @@
         <w:pStyle w:val="Heading2"/>
       </w:pPr>
       <w:r>
-        <w:t xml:space="preserve">R04 • Bloqueio coletivo e abuso na autenticação</w:t>
+        <w:t xml:space="preserve">R05 • Promoção da fila incompatível com o expediente</w:t>
       </w:r>
     </w:p>
     <w:p>
@@ -3726,35 +3859,35 @@
         <w:t xml:space="preserve">Classificação: </w:t>
       </w:r>
       <w:r>
-        <w:t xml:space="preserve">Segurança e disponibilidade | P 4 × I 3 = 12 | Nível 3/5 — Moderado.</w:t>
-      </w:r>
-    </w:p>
-    <w:p>
-      <w:pPr>
-        <w:pStyle w:val="Detail"/>
-      </w:pPr>
-      <w:r>
-        <w:rPr>
-          <w:b/>
-        </w:rPr>
-        <w:t xml:space="preserve">Evidência e análise: </w:t>
-      </w:r>
-      <w:r>
-        <w:t xml:space="preserve">Limitação observada no código; efeito depende da topologia. limitAuth usa req.socket.remoteAddress e um Map local de 30 tentativas por 15 minutos. Atrás de um proxy, clientes podem compartilhar a mesma chave e bloquear uns aos outros; múltiplas instâncias mantêm contadores diferentes. A senha mínima é de seis caracteres.</w:t>
-      </w:r>
-    </w:p>
-    <w:p>
-      <w:pPr>
-        <w:pStyle w:val="Detail"/>
-      </w:pPr>
-      <w:r>
-        <w:rPr>
-          <w:b/>
-        </w:rPr>
-        <w:t xml:space="preserve">Controles existentes: </w:t>
-      </w:r>
-      <w:r>
-        <w:t xml:space="preserve">Há limitação de tentativas, mensagem genérica de credenciais e hashing de senha.</w:t>
+        <w:t xml:space="preserve">Regras de negócio | P 4 × I 4 = 16 | Nível 4/5 — Alto.</w:t>
+      </w:r>
+    </w:p>
+    <w:p>
+      <w:pPr>
+        <w:pStyle w:val="Detail"/>
+      </w:pPr>
+      <w:r>
+        <w:rPr>
+          <w:b/>
+        </w:rPr>
+        <w:t xml:space="preserve">Cenário potencial: Se expediente, serviços ou disponibilidade mudarem enquanto houver pedidos na fila, uma promoção sem revalidação poderá gerar uma reserva impossível de atender.</w:t>
+      </w:r>
+      <w:r>
+        <w:t xml:space="preserve"/>
+      </w:r>
+    </w:p>
+    <w:p>
+      <w:pPr>
+        <w:pStyle w:val="Detail"/>
+      </w:pPr>
+      <w:r>
+        <w:rPr>
+          <w:b/>
+        </w:rPr>
+        <w:t xml:space="preserve">Controles preventivos a considerar: Prever revalidação da elegibilidade, processamento consistente e verificação de conflitos no momento da promoção.</w:t>
+      </w:r>
+      <w:r>
+        <w:t xml:space="preserve"/>
       </w:r>
     </w:p>
     <w:p>
@@ -3768,7 +3901,7 @@
         <w:t xml:space="preserve">Resposta recomendada: </w:t>
       </w:r>
       <w:r>
-        <w:t xml:space="preserve">Mitigar: identificar IP apenas por proxies confiáveis, combinar limite por conta/IP em armazenamento compartilhado, reforçar política de senhas e proteção de administradores.</w:t>
+        <w:t xml:space="preserve">Mitigar: revalidar elegibilidade no momento da promoção; apresentar impacto antes de mudar expediente/serviços; definir política para preservar ou renegociar preço e duração já prometidos.</w:t>
       </w:r>
     </w:p>
     <w:p>
@@ -3782,7 +3915,7 @@
         <w:t xml:space="preserve">Contingência: </w:t>
       </w:r>
       <w:r>
-        <w:t xml:space="preserve">Revisar bloqueios indevidos sem desligar toda a proteção; revogar sessões caso haja conta comprometida.</w:t>
+        <w:t xml:space="preserve">Suspender promoções afetadas, listar reservas incompatíveis e contatar clientes para remarcação.</w:t>
       </w:r>
     </w:p>
     <w:p>
@@ -3796,7 +3929,127 @@
         <w:t xml:space="preserve">Monitoramento e gatilho: </w:t>
       </w:r>
       <w:r>
-        <w:t xml:space="preserve">Diariamente: taxa de 429 e falhas por conta/origem. Alertar se mais de 5% dos logins forem bloqueados em 15 minutos; testar dois clientes atrás do mesmo proxy a cada mudança de infraestrutura.</w:t>
+        <w:t xml:space="preserve">Após qualquer mudança de profissional e diariamente: cruzar reservas/fila com expediente e serviços atuais. Limite: zero reservas incompatíveis; testar mudança de dia e retirada de serviço.</w:t>
+      </w:r>
+    </w:p>
+    <w:p>
+      <w:pPr>
+        <w:pStyle w:val="Detail"/>
+      </w:pPr>
+      <w:r>
+        <w:rPr>
+          <w:b/>
+        </w:rPr>
+        <w:t xml:space="preserve">Responsável / prazo: Backend e administrador da barbearia / Antes de liberar a promoção da fila.</w:t>
+      </w:r>
+      <w:r>
+        <w:t xml:space="preserve"/>
+      </w:r>
+    </w:p>
+    <w:p>
+      <w:pPr>
+        <w:pStyle w:val="Detail"/>
+      </w:pPr>
+      <w:r>
+        <w:rPr>
+          <w:b/>
+        </w:rPr>
+        <w:t xml:space="preserve">Validação futura: verificar o cenário e a eficácia dos controles no ambiente de homologação e registrar os resultados antes de confirmar a classificação.</w:t>
+      </w:r>
+      <w:r>
+        <w:t xml:space="preserve"/>
+      </w:r>
+    </w:p>
+    <w:p>
+      <w:pPr>
+        <w:pStyle w:val="Heading2"/>
+      </w:pPr>
+      <w:r>
+        <w:t xml:space="preserve">R06 • Fila de espera pouco acessível e sem acompanhamento</w:t>
+      </w:r>
+    </w:p>
+    <w:p>
+      <w:pPr>
+        <w:pStyle w:val="Detail"/>
+      </w:pPr>
+      <w:r>
+        <w:rPr>
+          <w:b/>
+        </w:rPr>
+        <w:t xml:space="preserve">Classificação: </w:t>
+      </w:r>
+      <w:r>
+        <w:t xml:space="preserve">Experiência e operação | P 4 × I 3 = 12 | Nível 3/5 — Moderado.</w:t>
+      </w:r>
+    </w:p>
+    <w:p>
+      <w:pPr>
+        <w:pStyle w:val="Detail"/>
+      </w:pPr>
+      <w:r>
+        <w:rPr>
+          <w:b/>
+        </w:rPr>
+        <w:t xml:space="preserve">Cenário potencial: Se a fila não oferecer entrada clara, acompanhamento, desistência e comunicação de promoções, clientes poderão perder oportunidades ou desconhecer reservas geradas.</w:t>
+      </w:r>
+      <w:r>
+        <w:t xml:space="preserve"/>
+      </w:r>
+    </w:p>
+    <w:p>
+      <w:pPr>
+        <w:pStyle w:val="Detail"/>
+      </w:pPr>
+      <w:r>
+        <w:rPr>
+          <w:b/>
+        </w:rPr>
+        <w:t xml:space="preserve">Controles preventivos a considerar: Planejar uma jornada completa da fila, prevenção de duplicidade e confirmação das comunicações relevantes.</w:t>
+      </w:r>
+      <w:r>
+        <w:t xml:space="preserve"/>
+      </w:r>
+    </w:p>
+    <w:p>
+      <w:pPr>
+        <w:pStyle w:val="Detail"/>
+      </w:pPr>
+      <w:r>
+        <w:rPr>
+          <w:b/>
+        </w:rPr>
+        <w:t xml:space="preserve">Resposta recomendada: </w:t>
+      </w:r>
+      <w:r>
+        <w:t xml:space="preserve">Mitigar: oferecer horários ocupados com ação de fila; permitir consultar e desistir; avisar promoções e solicitar confirmação conforme regra acordada.</w:t>
+      </w:r>
+    </w:p>
+    <w:p>
+      <w:pPr>
+        <w:pStyle w:val="Detail"/>
+      </w:pPr>
+      <w:r>
+        <w:rPr>
+          <w:b/>
+        </w:rPr>
+        <w:t xml:space="preserve">Contingência: </w:t>
+      </w:r>
+      <w:r>
+        <w:t xml:space="preserve">Recepção acompanha a fila e confirma manualmente a disponibilidade do cliente antes do atendimento.</w:t>
+      </w:r>
+    </w:p>
+    <w:p>
+      <w:pPr>
+        <w:pStyle w:val="Detail"/>
+      </w:pPr>
+      <w:r>
+        <w:rPr>
+          <w:b/>
+        </w:rPr>
+        <w:t xml:space="preserve">Monitoramento e gatilho: </w:t>
+      </w:r>
+      <w:r>
+        <w:t xml:space="preserve">Semanalmente: testar entrada em horário já ocupado e medir promoções sem ciência do cliente. Alertar por qualquer fila inacessível no teste ou promoção sem confirmação operacional.</w:t>
       </w:r>
     </w:p>
     <w:p>
@@ -3810,21 +4063,21 @@
         <w:t xml:space="preserve">Responsável / prazo: </w:t>
       </w:r>
       <w:r>
-        <w:t xml:space="preserve">Backend e infraestrutura / Antes da hospedagem atrás de proxy.</w:t>
-      </w:r>
-    </w:p>
-    <w:p>
-      <w:pPr>
-        <w:pStyle w:val="Detail"/>
-      </w:pPr>
-      <w:r>
-        <w:rPr>
-          <w:b/>
-        </w:rPr>
-        <w:t xml:space="preserve">Referências locais: </w:t>
-      </w:r>
-      <w:r>
-        <w:t xml:space="preserve">backend/app.js: limitAuth; backend/security.js: hashPassword.</w:t>
+        <w:t xml:space="preserve">Frontend, backend e atendimento / Próxima entrega funcional.</w:t>
+      </w:r>
+    </w:p>
+    <w:p>
+      <w:pPr>
+        <w:pStyle w:val="Detail"/>
+      </w:pPr>
+      <w:r>
+        <w:rPr>
+          <w:b/>
+        </w:rPr>
+        <w:t xml:space="preserve">Validação futura: verificar o cenário e a eficácia dos controles no ambiente de homologação e registrar os resultados antes de confirmar a classificação.</w:t>
+      </w:r>
+      <w:r>
+        <w:t xml:space="preserve"/>
       </w:r>
     </w:p>
     <w:p>
@@ -3845,7 +4098,7 @@
         <w:pStyle w:val="Heading2"/>
       </w:pPr>
       <w:r>
-        <w:t xml:space="preserve">R05 • Promoção da fila incompatível com o expediente</w:t>
+        <w:t xml:space="preserve">R07 • Regressões publicadas sem validação automática</w:t>
       </w:r>
     </w:p>
     <w:p>
@@ -3859,35 +4112,35 @@
         <w:t xml:space="preserve">Classificação: </w:t>
       </w:r>
       <w:r>
-        <w:t xml:space="preserve">Regras de negócio | P 4 × I 4 = 16 | Nível 4/5 — Alto.</w:t>
-      </w:r>
-    </w:p>
-    <w:p>
-      <w:pPr>
-        <w:pStyle w:val="Detail"/>
-      </w:pPr>
-      <w:r>
-        <w:rPr>
-          <w:b/>
-        </w:rPr>
-        <w:t xml:space="preserve">Evidência e análise: </w:t>
-      </w:r>
-      <w:r>
-        <w:t xml:space="preserve">Lacuna constatada por leitura; reprodução em banco pendente. saveBarber altera dias, horários e serviços sem reconciliar reservas existentes. promote verifica conflito, profissional ativo e data futura, mas não revalida dias, expediente ou vínculo atual do serviço. Um pedido antigo pode virar reserva que o profissional não pode atender.</w:t>
-      </w:r>
-    </w:p>
-    <w:p>
-      <w:pPr>
-        <w:pStyle w:val="Detail"/>
-      </w:pPr>
-      <w:r>
-        <w:rPr>
-          <w:b/>
-        </w:rPr>
-        <w:t xml:space="preserve">Controles existentes: </w:t>
-      </w:r>
-      <w:r>
-        <w:t xml:space="preserve">Promoção transacional, fila ordenada por ID e verificação de sobreposição.</w:t>
+        <w:t xml:space="preserve">Qualidade | P 4 × I 4 = 16 | Nível 4/5 — Alto.</w:t>
+      </w:r>
+    </w:p>
+    <w:p>
+      <w:pPr>
+        <w:pStyle w:val="Detail"/>
+      </w:pPr>
+      <w:r>
+        <w:rPr>
+          <w:b/>
+        </w:rPr>
+        <w:t xml:space="preserve">Cenário potencial: Se uma entrega for liberada com validações insuficientes ou testes essenciais ignorados, regressões poderão afetar permissões, reservas e outros fluxos.</w:t>
+      </w:r>
+      <w:r>
+        <w:t xml:space="preserve"/>
+      </w:r>
+    </w:p>
+    <w:p>
+      <w:pPr>
+        <w:pStyle w:val="Detail"/>
+      </w:pPr>
+      <w:r>
+        <w:rPr>
+          <w:b/>
+        </w:rPr>
+        <w:t xml:space="preserve">Controles preventivos a considerar: Definir testes essenciais, ambiente de homologação e critérios de bloqueio da publicação diante de falhas.</w:t>
+      </w:r>
+      <w:r>
+        <w:t xml:space="preserve"/>
       </w:r>
     </w:p>
     <w:p>
@@ -3901,7 +4154,7 @@
         <w:t xml:space="preserve">Resposta recomendada: </w:t>
       </w:r>
       <w:r>
-        <w:t xml:space="preserve">Mitigar: revalidar elegibilidade no momento da promoção; apresentar impacto antes de mudar expediente/serviços; definir política para preservar ou renegociar preço e duração já prometidos.</w:t>
+        <w:t xml:space="preserve">Mitigar: executar testes no CI com PostgreSQL descartável, bloquear publicação em falhas e verificar que a integração não foi ignorada. Incluir testes de navegador para login, reserva, cancelamento, fila e administração.</w:t>
       </w:r>
     </w:p>
     <w:p>
@@ -3915,7 +4168,7 @@
         <w:t xml:space="preserve">Contingência: </w:t>
       </w:r>
       <w:r>
-        <w:t xml:space="preserve">Suspender promoções afetadas, listar reservas incompatíveis e contatar clientes para remarcação.</w:t>
+        <w:t xml:space="preserve">Reverter a versão com regressão; reproduzir o caso e criar verificação antes de republicar.</w:t>
       </w:r>
     </w:p>
     <w:p>
@@ -3929,7 +4182,7 @@
         <w:t xml:space="preserve">Monitoramento e gatilho: </w:t>
       </w:r>
       <w:r>
-        <w:t xml:space="preserve">Após qualquer mudança de profissional e diariamente: cruzar reservas/fila com expediente e serviços atuais. Limite: zero reservas incompatíveis; testar mudança de dia e retirada de serviço.</w:t>
+        <w:t xml:space="preserve">Em toda alteração: acompanhar testes executados e ignorados. Limite: zero falhas e zero testes essenciais ignorados para publicar.</w:t>
       </w:r>
     </w:p>
     <w:p>
@@ -3943,21 +4196,21 @@
         <w:t xml:space="preserve">Responsável / prazo: </w:t>
       </w:r>
       <w:r>
-        <w:t xml:space="preserve">Backend e administrador da barbearia / Próxima correção de regras.</w:t>
-      </w:r>
-    </w:p>
-    <w:p>
-      <w:pPr>
-        <w:pStyle w:val="Detail"/>
-      </w:pPr>
-      <w:r>
-        <w:rPr>
-          <w:b/>
-        </w:rPr>
-        <w:t xml:space="preserve">Referências locais: </w:t>
-      </w:r>
-      <w:r>
-        <w:t xml:space="preserve">backend/app.js: saveBarber; backend/bookings.js: promote/prepare.</w:t>
+        <w:t xml:space="preserve">Desenvolvimento e qualidade / Antes da próxima publicação.</w:t>
+      </w:r>
+    </w:p>
+    <w:p>
+      <w:pPr>
+        <w:pStyle w:val="Detail"/>
+      </w:pPr>
+      <w:r>
+        <w:rPr>
+          <w:b/>
+        </w:rPr>
+        <w:t xml:space="preserve">Validação futura: verificar o cenário e a eficácia dos controles no ambiente de homologação e registrar os resultados antes de confirmar a classificação.</w:t>
+      </w:r>
+      <w:r>
+        <w:t xml:space="preserve"/>
       </w:r>
     </w:p>
     <w:p>
@@ -3965,7 +4218,7 @@
         <w:pStyle w:val="Heading2"/>
       </w:pPr>
       <w:r>
-        <w:t xml:space="preserve">R06 • Fila de espera pouco acessível e sem acompanhamento</w:t>
+        <w:t xml:space="preserve">R08 • Falha de instalação ou migração de dados legados</w:t>
       </w:r>
     </w:p>
     <w:p>
@@ -3979,35 +4232,35 @@
         <w:t xml:space="preserve">Classificação: </w:t>
       </w:r>
       <w:r>
-        <w:t xml:space="preserve">Experiência e operação | P 4 × I 3 = 12 | Nível 3/5 — Moderado.</w:t>
-      </w:r>
-    </w:p>
-    <w:p>
-      <w:pPr>
-        <w:pStyle w:val="Detail"/>
-      </w:pPr>
-      <w:r>
-        <w:rPr>
-          <w:b/>
-        </w:rPr>
-        <w:t xml:space="preserve">Evidência e análise: </w:t>
-      </w:r>
-      <w:r>
-        <w:t xml:space="preserve">Comportamento constatado no fluxo da interface e da API. A interface remove horários ocupados e só oferece fila após erro SLOT_TAKEN. Assim, um cliente normalmente não consegue escolher um horário já ocupado para entrar na fila. A API tem criação, mas não consulta/cancelamento da fila; não foi encontrada notificação da promoção.</w:t>
-      </w:r>
-    </w:p>
-    <w:p>
-      <w:pPr>
-        <w:pStyle w:val="Detail"/>
-      </w:pPr>
-      <w:r>
-        <w:rPr>
-          <w:b/>
-        </w:rPr>
-        <w:t xml:space="preserve">Controles existentes: </w:t>
-      </w:r>
-      <w:r>
-        <w:t xml:space="preserve">Há inserção sem duplicidade por cliente/horário e promoção automática no backend.</w:t>
+        <w:t xml:space="preserve">Implantação e dados | P 3 × I 4 = 12 | Nível 3/5 — Moderado.</w:t>
+      </w:r>
+    </w:p>
+    <w:p>
+      <w:pPr>
+        <w:pStyle w:val="Detail"/>
+      </w:pPr>
+      <w:r>
+        <w:rPr>
+          <w:b/>
+        </w:rPr>
+        <w:t xml:space="preserve">Cenário potencial: Configurações incompletas, diferenças de ambiente ou dados legados incompatíveis poderão impedir a instalação, interromper migrações ou bloquear contas.</w:t>
+      </w:r>
+      <w:r>
+        <w:t xml:space="preserve"/>
+      </w:r>
+    </w:p>
+    <w:p>
+      <w:pPr>
+        <w:pStyle w:val="Detail"/>
+      </w:pPr>
+      <w:r>
+        <w:rPr>
+          <w:b/>
+        </w:rPr>
+        <w:t xml:space="preserve">Controles preventivos a considerar: Prever modelos de configuração, migrações versionadas, diagnóstico de dados e ensaio de instalação e recuperação.</w:t>
+      </w:r>
+      <w:r>
+        <w:t xml:space="preserve"/>
       </w:r>
     </w:p>
     <w:p>
@@ -4021,7 +4274,7 @@
         <w:t xml:space="preserve">Resposta recomendada: </w:t>
       </w:r>
       <w:r>
-        <w:t xml:space="preserve">Mitigar: oferecer horários ocupados com ação de fila; permitir consultar e desistir; avisar promoções e solicitar confirmação conforme regra acordada.</w:t>
+        <w:t xml:space="preserve">Mitigar: fornecer modelo de configuração sem segredos; criar diagnóstico prévio de dados; ensaiar migração em cópia; definir recuperação segura de contas legadas e checklist de instalação.</w:t>
       </w:r>
     </w:p>
     <w:p>
@@ -4035,7 +4288,7 @@
         <w:t xml:space="preserve">Contingência: </w:t>
       </w:r>
       <w:r>
-        <w:t xml:space="preserve">Recepção acompanha a fila e confirma manualmente a disponibilidade do cliente antes do atendimento.</w:t>
+        <w:t xml:space="preserve">Manter versão anterior compatível e backup verificado; corrigir inconsistências em cópia antes de nova tentativa.</w:t>
       </w:r>
     </w:p>
     <w:p>
@@ -4049,7 +4302,7 @@
         <w:t xml:space="preserve">Monitoramento e gatilho: </w:t>
       </w:r>
       <w:r>
-        <w:t xml:space="preserve">Semanalmente: testar entrada em horário já ocupado e medir promoções sem ciência do cliente. Alertar por qualquer fila inacessível no teste ou promoção sem confirmação operacional.</w:t>
+        <w:t xml:space="preserve">A cada instalação/migração: validar variáveis, versão do esquema, contagens e login de contas migradas. Qualquer erro ou diferença não explicada impede liberação.</w:t>
       </w:r>
     </w:p>
     <w:p>
@@ -4063,21 +4316,21 @@
         <w:t xml:space="preserve">Responsável / prazo: </w:t>
       </w:r>
       <w:r>
-        <w:t xml:space="preserve">Frontend, backend e atendimento / Próxima entrega funcional.</w:t>
-      </w:r>
-    </w:p>
-    <w:p>
-      <w:pPr>
-        <w:pStyle w:val="Detail"/>
-      </w:pPr>
-      <w:r>
-        <w:rPr>
-          <w:b/>
-        </w:rPr>
-        <w:t xml:space="preserve">Referências locais: </w:t>
-      </w:r>
-      <w:r>
-        <w:t xml:space="preserve">js/app.js: generateBarberSlots/loadFormPage/joinWaitlist; backend/app.js: /api/waitlist.</w:t>
+        <w:t xml:space="preserve">Backend e responsável pelo banco / Antes da primeira implantação/migração.</w:t>
+      </w:r>
+    </w:p>
+    <w:p>
+      <w:pPr>
+        <w:pStyle w:val="Detail"/>
+      </w:pPr>
+      <w:r>
+        <w:rPr>
+          <w:b/>
+        </w:rPr>
+        <w:t xml:space="preserve">Validação futura: verificar o cenário e a eficácia dos controles no ambiente de homologação e registrar os resultados antes de confirmar a classificação.</w:t>
+      </w:r>
+      <w:r>
+        <w:t xml:space="preserve"/>
       </w:r>
     </w:p>
     <w:p>
@@ -4098,7 +4351,7 @@
         <w:pStyle w:val="Heading2"/>
       </w:pPr>
       <w:r>
-        <w:t xml:space="preserve">R07 • Regressões publicadas sem validação automática</w:t>
+        <w:t xml:space="preserve">R09 • Lentidão com aumento do volume</w:t>
       </w:r>
     </w:p>
     <w:p>
@@ -4112,35 +4365,155 @@
         <w:t xml:space="preserve">Classificação: </w:t>
       </w:r>
       <w:r>
-        <w:t xml:space="preserve">Qualidade | P 4 × I 4 = 16 | Nível 4/5 — Alto.</w:t>
-      </w:r>
-    </w:p>
-    <w:p>
-      <w:pPr>
-        <w:pStyle w:val="Detail"/>
-      </w:pPr>
-      <w:r>
-        <w:rPr>
-          <w:b/>
-        </w:rPr>
-        <w:t xml:space="preserve">Evidência e análise: </w:t>
-      </w:r>
-      <w:r>
-        <w:t xml:space="preserve">Lacuna observada no workflow. O deploy não executa testes. Há dois testes unitários e um teste de integração condicionado a TEST_DATABASE_URL. Uma publicação pode parecer bem-sucedida sem validar permissões, concorrência, migração ou os fluxos de navegador.</w:t>
-      </w:r>
-    </w:p>
-    <w:p>
-      <w:pPr>
-        <w:pStyle w:val="Detail"/>
-      </w:pPr>
-      <w:r>
-        <w:rPr>
-          <w:b/>
-        </w:rPr>
-        <w:t xml:space="preserve">Controles existentes: </w:t>
-      </w:r>
-      <w:r>
-        <w:t xml:space="preserve">A suíte existente cobre cenários relevantes de segurança e, com banco, concorrência, fila e moderação. Nesta análise: 2 testes passaram e 1 foi ignorado.</w:t>
+        <w:t xml:space="preserve">Desempenho | P 3 × I 4 = 12 | Nível 3/5 — Moderado.</w:t>
+      </w:r>
+    </w:p>
+    <w:p>
+      <w:pPr>
+        <w:pStyle w:val="Detail"/>
+      </w:pPr>
+      <w:r>
+        <w:rPr>
+          <w:b/>
+        </w:rPr>
+        <w:t xml:space="preserve">Cenário potencial: O crescimento de usuários, reservas e imagens poderá exceder a capacidade planejada, aumentando latência, tráfego e consumo de recursos.</w:t>
+      </w:r>
+      <w:r>
+        <w:t xml:space="preserve"/>
+      </w:r>
+    </w:p>
+    <w:p>
+      <w:pPr>
+        <w:pStyle w:val="Detail"/>
+      </w:pPr>
+      <w:r>
+        <w:rPr>
+          <w:b/>
+        </w:rPr>
+        <w:t xml:space="preserve">Controles preventivos a considerar: Planejar índices, limites de resposta, gestão de conexões e testes de carga compatíveis com o volume esperado.</w:t>
+      </w:r>
+      <w:r>
+        <w:t xml:space="preserve"/>
+      </w:r>
+    </w:p>
+    <w:p>
+      <w:pPr>
+        <w:pStyle w:val="Detail"/>
+      </w:pPr>
+      <w:r>
+        <w:rPr>
+          <w:b/>
+        </w:rPr>
+        <w:t xml:space="preserve">Resposta recomendada: Mitigar: medir carga representativa; planejar paginação, filtros, limites de resposta e armazenamento de imagens. Dimensionar concorrência e capacidade com testes que preservem a consistência das reservas.</w:t>
+      </w:r>
+      <w:r>
+        <w:t xml:space="preserve"/>
+      </w:r>
+    </w:p>
+    <w:p>
+      <w:pPr>
+        <w:pStyle w:val="Detail"/>
+      </w:pPr>
+      <w:r>
+        <w:rPr>
+          <w:b/>
+        </w:rPr>
+        <w:t xml:space="preserve">Contingência: </w:t>
+      </w:r>
+      <w:r>
+        <w:t xml:space="preserve">Reduzir operações em lote e volume retornado; ampliar capacidade conforme medição, preservando as proteções contra conflito.</w:t>
+      </w:r>
+    </w:p>
+    <w:p>
+      <w:pPr>
+        <w:pStyle w:val="Detail"/>
+      </w:pPr>
+      <w:r>
+        <w:rPr>
+          <w:b/>
+        </w:rPr>
+        <w:t xml:space="preserve">Monitoramento e gatilho: </w:t>
+      </w:r>
+      <w:r>
+        <w:t xml:space="preserve">Semanalmente e em pico: latência p95, espera de locks, conexões e tamanho das respostas. Alertar se p95 superar 2 segundos por 10 minutos ou pool ficar saturado.</w:t>
+      </w:r>
+    </w:p>
+    <w:p>
+      <w:pPr>
+        <w:pStyle w:val="Detail"/>
+      </w:pPr>
+      <w:r>
+        <w:rPr>
+          <w:b/>
+        </w:rPr>
+        <w:t xml:space="preserve">Responsável / prazo: </w:t>
+      </w:r>
+      <w:r>
+        <w:t xml:space="preserve">Backend e infraestrutura / Antes de ampliar número de usuários.</w:t>
+      </w:r>
+    </w:p>
+    <w:p>
+      <w:pPr>
+        <w:pStyle w:val="Detail"/>
+      </w:pPr>
+      <w:r>
+        <w:rPr>
+          <w:b/>
+        </w:rPr>
+        <w:t xml:space="preserve">Validação futura: verificar o cenário e a eficácia dos controles no ambiente de homologação e registrar os resultados antes de confirmar a classificação.</w:t>
+      </w:r>
+      <w:r>
+        <w:t xml:space="preserve"/>
+      </w:r>
+    </w:p>
+    <w:p>
+      <w:pPr>
+        <w:pStyle w:val="Heading2"/>
+      </w:pPr>
+      <w:r>
+        <w:t xml:space="preserve">R10 • Reservas sobrepostas por escrita fora da API</w:t>
+      </w:r>
+    </w:p>
+    <w:p>
+      <w:pPr>
+        <w:pStyle w:val="Detail"/>
+      </w:pPr>
+      <w:r>
+        <w:rPr>
+          <w:b/>
+        </w:rPr>
+        <w:t xml:space="preserve">Classificação: </w:t>
+      </w:r>
+      <w:r>
+        <w:t xml:space="preserve">Integridade | P 2 × I 4 = 8 | Nível 2/5 — Baixo.</w:t>
+      </w:r>
+    </w:p>
+    <w:p>
+      <w:pPr>
+        <w:pStyle w:val="Detail"/>
+      </w:pPr>
+      <w:r>
+        <w:rPr>
+          <w:b/>
+        </w:rPr>
+        <w:t xml:space="preserve">Cenário potencial: Importações, integrações ou intervenções diretas que não respeitem as regras da agenda poderão criar reservas sobrepostas ou desalinhar a fila.</w:t>
+      </w:r>
+      <w:r>
+        <w:t xml:space="preserve"/>
+      </w:r>
+    </w:p>
+    <w:p>
+      <w:pPr>
+        <w:pStyle w:val="Detail"/>
+      </w:pPr>
+      <w:r>
+        <w:rPr>
+          <w:b/>
+        </w:rPr>
+        <w:t xml:space="preserve">Controles preventivos a considerar: Prever permissões restritas, operações controladas e garantias de integridade para todos os canais de escrita.</w:t>
+      </w:r>
+      <w:r>
+        <w:t xml:space="preserve"/>
       </w:r>
     </w:p>
     <w:p>
@@ -4154,7 +4527,7 @@
         <w:t xml:space="preserve">Resposta recomendada: </w:t>
       </w:r>
       <w:r>
-        <w:t xml:space="preserve">Mitigar: executar testes no CI com PostgreSQL descartável, bloquear publicação em falhas e verificar que a integração não foi ignorada. Incluir testes de navegador para login, reserva, cancelamento, fila e administração.</w:t>
+        <w:t xml:space="preserve">Evitar escritas manuais de agenda: restringir permissões e usar operações controladas. Avaliar restrição de exclusão por intervalo no banco e testes de importação.</w:t>
       </w:r>
     </w:p>
     <w:p>
@@ -4168,7 +4541,7 @@
         <w:t xml:space="preserve">Contingência: </w:t>
       </w:r>
       <w:r>
-        <w:t xml:space="preserve">Reverter a versão com regressão; reproduzir o caso e criar verificação antes de republicar.</w:t>
+        <w:t xml:space="preserve">Bloquear a rotina causadora; identificar os clientes afetados e ajustar a agenda com registro da decisão.</w:t>
       </w:r>
     </w:p>
     <w:p>
@@ -4182,7 +4555,7 @@
         <w:t xml:space="preserve">Monitoramento e gatilho: </w:t>
       </w:r>
       <w:r>
-        <w:t xml:space="preserve">Em toda alteração: acompanhar testes executados e ignorados. Limite: zero falhas e zero testes essenciais ignorados para publicar.</w:t>
+        <w:t xml:space="preserve">Diariamente e após importação: consulta de intervalos ativos sobrepostos por profissional/data. Limite: zero; revisar acessos de escrita mensalmente.</w:t>
       </w:r>
     </w:p>
     <w:p>
@@ -4196,21 +4569,34 @@
         <w:t xml:space="preserve">Responsável / prazo: </w:t>
       </w:r>
       <w:r>
-        <w:t xml:space="preserve">Desenvolvimento e qualidade / Antes da próxima publicação.</w:t>
-      </w:r>
-    </w:p>
-    <w:p>
-      <w:pPr>
-        <w:pStyle w:val="Detail"/>
-      </w:pPr>
-      <w:r>
-        <w:rPr>
-          <w:b/>
-        </w:rPr>
-        <w:t xml:space="preserve">Referências locais: </w:t>
-      </w:r>
-      <w:r>
-        <w:t xml:space="preserve">.github/workflows/deploy.yml; backend/test/security.test.js; backend/test/integration.test.js; package.json.</w:t>
+        <w:t xml:space="preserve">Responsável pelo banco e backend / Antes de integrações ou importações.</w:t>
+      </w:r>
+    </w:p>
+    <w:p>
+      <w:pPr>
+        <w:pStyle w:val="Detail"/>
+      </w:pPr>
+      <w:r>
+        <w:rPr>
+          <w:b/>
+        </w:rPr>
+        <w:t xml:space="preserve">Validação futura: verificar o cenário e a eficácia dos controles no ambiente de homologação e registrar os resultados antes de confirmar a classificação.</w:t>
+      </w:r>
+      <w:r>
+        <w:t xml:space="preserve"/>
+      </w:r>
+    </w:p>
+    <w:p>
+      <w:r>
+        <w:br w:type="page"/>
+      </w:r>
+    </w:p>
+    <w:p>
+      <w:pPr>
+        <w:pStyle w:val="Heading1"/>
+      </w:pPr>
+      <w:r>
+        <w:t xml:space="preserve">5. Análise e resposta por risco — continuação</w:t>
       </w:r>
     </w:p>
     <w:p>
@@ -4218,7 +4604,7 @@
         <w:pStyle w:val="Heading2"/>
       </w:pPr>
       <w:r>
-        <w:t xml:space="preserve">R08 • Falha de instalação ou migração de dados legados</w:t>
+        <w:t xml:space="preserve">R11 • Histórico e indicadores alterados sem rastreabilidade</w:t>
       </w:r>
     </w:p>
     <w:p>
@@ -4232,35 +4618,35 @@
         <w:t xml:space="preserve">Classificação: </w:t>
       </w:r>
       <w:r>
-        <w:t xml:space="preserve">Implantação e dados | P 3 × I 4 = 12 | Nível 3/5 — Moderado.</w:t>
-      </w:r>
-    </w:p>
-    <w:p>
-      <w:pPr>
-        <w:pStyle w:val="Detail"/>
-      </w:pPr>
-      <w:r>
-        <w:rPr>
-          <w:b/>
-        </w:rPr>
-        <w:t xml:space="preserve">Evidência e análise: </w:t>
-      </w:r>
-      <w:r>
-        <w:t xml:space="preserve">Inconsistência documental constatada; compatibilidade do banco não ensaiada. Os guias pedem copiar .env.example, mas esse arquivo não está no inventário. A migração adiciona unicidade e restrições que podem rejeitar registros legados; senhas antigas fora do formato scrypt não autenticam. Isso pode atrasar a implantação e bloquear usuários.</w:t>
-      </w:r>
-    </w:p>
-    <w:p>
-      <w:pPr>
-        <w:pStyle w:val="Detail"/>
-      </w:pPr>
-      <w:r>
-        <w:rPr>
-          <w:b/>
-        </w:rPr>
-        <w:t xml:space="preserve">Controles existentes: </w:t>
-      </w:r>
-      <w:r>
-        <w:t xml:space="preserve">Migração transacional, trava de migração, controle de versão e orientações sobre duplicidades e senhas no README do backend.</w:t>
+        <w:t xml:space="preserve">Operação e informação gerencial | P 3 × I 4 = 12 | Nível 3/5 — Moderado.</w:t>
+      </w:r>
+    </w:p>
+    <w:p>
+      <w:pPr>
+        <w:pStyle w:val="Detail"/>
+      </w:pPr>
+      <w:r>
+        <w:rPr>
+          <w:b/>
+        </w:rPr>
+        <w:t xml:space="preserve">Cenário potencial: Se alterações e exclusões não preservarem autoria, motivo e histórico, poderão distorcer indicadores e dificultar a apuração de divergências de atendimento.</w:t>
+      </w:r>
+      <w:r>
+        <w:t xml:space="preserve"/>
+      </w:r>
+    </w:p>
+    <w:p>
+      <w:pPr>
+        <w:pStyle w:val="Detail"/>
+      </w:pPr>
+      <w:r>
+        <w:rPr>
+          <w:b/>
+        </w:rPr>
+        <w:t xml:space="preserve">Controles preventivos a considerar: Planejar autorização, trilha de auditoria, transições de status e definição clara dos indicadores gerenciais.</w:t>
+      </w:r>
+      <w:r>
+        <w:t xml:space="preserve"/>
       </w:r>
     </w:p>
     <w:p>
@@ -4274,7 +4660,7 @@
         <w:t xml:space="preserve">Resposta recomendada: </w:t>
       </w:r>
       <w:r>
-        <w:t xml:space="preserve">Mitigar: fornecer modelo de configuração sem segredos; criar diagnóstico prévio de dados; ensaiar migração em cópia; definir recuperação segura de contas legadas e checklist de instalação.</w:t>
+        <w:t xml:space="preserve">Mitigar: preferir cancelamento/arquivamento, registrar autor/data/motivo e mudanças, definir transições permitidas e distinguir serviço concluído de pagamento recebido.</w:t>
       </w:r>
     </w:p>
     <w:p>
@@ -4288,7 +4674,7 @@
         <w:t xml:space="preserve">Contingência: </w:t>
       </w:r>
       <w:r>
-        <w:t xml:space="preserve">Manter versão anterior compatível e backup verificado; corrigir inconsistências em cópia antes de nova tentativa.</w:t>
+        <w:t xml:space="preserve">Reconciliar histórico com registros de atendimento; corrigir por operação auditada, preservando evidências.</w:t>
       </w:r>
     </w:p>
     <w:p>
@@ -4302,7 +4688,7 @@
         <w:t xml:space="preserve">Monitoramento e gatilho: </w:t>
       </w:r>
       <w:r>
-        <w:t xml:space="preserve">A cada instalação/migração: validar variáveis, versão do esquema, contagens e login de contas migradas. Qualquer erro ou diferença não explicada impede liberação.</w:t>
+        <w:t xml:space="preserve">Diariamente: revisar exclusões, mudanças de status encerrado e divergências com atendimentos. Qualquer exclusão sem justificativa ou diferença não explicada exige revisão.</w:t>
       </w:r>
     </w:p>
     <w:p>
@@ -4316,21 +4702,141 @@
         <w:t xml:space="preserve">Responsável / prazo: </w:t>
       </w:r>
       <w:r>
-        <w:t xml:space="preserve">Backend e responsável pelo banco / Antes da primeira implantação/migração.</w:t>
-      </w:r>
-    </w:p>
-    <w:p>
-      <w:pPr>
-        <w:pStyle w:val="Detail"/>
-      </w:pPr>
-      <w:r>
-        <w:rPr>
-          <w:b/>
-        </w:rPr>
-        <w:t xml:space="preserve">Referências locais: </w:t>
-      </w:r>
-      <w:r>
-        <w:t xml:space="preserve">backend/migrate.js; backend/schema.sql; backend/README.md; LEIA-ME.txt; .gitignore.</w:t>
+        <w:t xml:space="preserve">Gestor da barbearia e backend / Antes de usar o painel como controle gerencial.</w:t>
+      </w:r>
+    </w:p>
+    <w:p>
+      <w:pPr>
+        <w:pStyle w:val="Detail"/>
+      </w:pPr>
+      <w:r>
+        <w:rPr>
+          <w:b/>
+        </w:rPr>
+        <w:t xml:space="preserve">Validação futura: verificar o cenário e a eficácia dos controles no ambiente de homologação e registrar os resultados antes de confirmar a classificação.</w:t>
+      </w:r>
+      <w:r>
+        <w:t xml:space="preserve"/>
+      </w:r>
+    </w:p>
+    <w:p>
+      <w:pPr>
+        <w:pStyle w:val="Heading2"/>
+      </w:pPr>
+      <w:r>
+        <w:t xml:space="preserve">R12 • Dados pessoais sem ciclo de tratamento definido</w:t>
+      </w:r>
+    </w:p>
+    <w:p>
+      <w:pPr>
+        <w:pStyle w:val="Detail"/>
+      </w:pPr>
+      <w:r>
+        <w:rPr>
+          <w:b/>
+        </w:rPr>
+        <w:t xml:space="preserve">Classificação: </w:t>
+      </w:r>
+      <w:r>
+        <w:t xml:space="preserve">Privacidade e governança | P 3 × I 4 = 12 | Nível 3/5 — Moderado.</w:t>
+      </w:r>
+    </w:p>
+    <w:p>
+      <w:pPr>
+        <w:pStyle w:val="Detail"/>
+      </w:pPr>
+      <w:r>
+        <w:rPr>
+          <w:b/>
+        </w:rPr>
+        <w:t xml:space="preserve">Cenário potencial: Se finalidades, acesso, retenção e descarte não forem definidos, dados pessoais poderão ser mantidos ou expostos além do necessário e solicitações poderão ficar sem tratamento.</w:t>
+      </w:r>
+      <w:r>
+        <w:t xml:space="preserve"/>
+      </w:r>
+    </w:p>
+    <w:p>
+      <w:pPr>
+        <w:pStyle w:val="Detail"/>
+      </w:pPr>
+      <w:r>
+        <w:rPr>
+          <w:b/>
+        </w:rPr>
+        <w:t xml:space="preserve">Controles preventivos a considerar: Planejar minimização de dados, acesso por função e procedimentos documentados para seu ciclo de tratamento.</w:t>
+      </w:r>
+      <w:r>
+        <w:t xml:space="preserve"/>
+      </w:r>
+    </w:p>
+    <w:p>
+      <w:pPr>
+        <w:pStyle w:val="Detail"/>
+      </w:pPr>
+      <w:r>
+        <w:rPr>
+          <w:b/>
+        </w:rPr>
+        <w:t xml:space="preserve">Resposta recomendada: </w:t>
+      </w:r>
+      <w:r>
+        <w:t xml:space="preserve">Mitigar: inventariar dados e finalidades; minimizar campos públicos; definir retenção, acesso e tratamento de solicitações com anonimização compatível com histórico. Validar os requisitos aplicáveis com o responsável pela privacidade.</w:t>
+      </w:r>
+    </w:p>
+    <w:p>
+      <w:pPr>
+        <w:pStyle w:val="Detail"/>
+      </w:pPr>
+      <w:r>
+        <w:rPr>
+          <w:b/>
+        </w:rPr>
+        <w:t xml:space="preserve">Contingência: </w:t>
+      </w:r>
+      <w:r>
+        <w:t xml:space="preserve">Conter exposição, preservar evidências e encaminhar o incidente ao responsável pelo tratamento de dados.</w:t>
+      </w:r>
+    </w:p>
+    <w:p>
+      <w:pPr>
+        <w:pStyle w:val="Detail"/>
+      </w:pPr>
+      <w:r>
+        <w:rPr>
+          <w:b/>
+        </w:rPr>
+        <w:t xml:space="preserve">Monitoramento e gatilho: </w:t>
+      </w:r>
+      <w:r>
+        <w:t xml:space="preserve">Mensalmente: revisar campos públicos, acessos e registros vencidos. Limite: zero campo pessoal desnecessário publicado; tratar solicitações no prazo interno definido e monitorado.</w:t>
+      </w:r>
+    </w:p>
+    <w:p>
+      <w:pPr>
+        <w:pStyle w:val="Detail"/>
+      </w:pPr>
+      <w:r>
+        <w:rPr>
+          <w:b/>
+        </w:rPr>
+        <w:t xml:space="preserve">Responsável / prazo: </w:t>
+      </w:r>
+      <w:r>
+        <w:t xml:space="preserve">Gestão e responsável por privacidade / Antes de coletar dados reais.</w:t>
+      </w:r>
+    </w:p>
+    <w:p>
+      <w:pPr>
+        <w:pStyle w:val="Detail"/>
+      </w:pPr>
+      <w:r>
+        <w:rPr>
+          <w:b/>
+        </w:rPr>
+        <w:t xml:space="preserve">Validação futura: verificar o cenário e a eficácia dos controles no ambiente de homologação e registrar os resultados antes de confirmar a classificação.</w:t>
+      </w:r>
+      <w:r>
+        <w:t xml:space="preserve"/>
       </w:r>
     </w:p>
     <w:p>
@@ -4351,7 +4857,7 @@
         <w:pStyle w:val="Heading2"/>
       </w:pPr>
       <w:r>
-        <w:t xml:space="preserve">R09 • Lentidão com aumento do volume</w:t>
+        <w:t xml:space="preserve">R13 • Falhas de rede confundidas com ausência de dados</w:t>
       </w:r>
     </w:p>
     <w:p>
@@ -4365,35 +4871,35 @@
         <w:t xml:space="preserve">Classificação: </w:t>
       </w:r>
       <w:r>
-        <w:t xml:space="preserve">Desempenho | P 3 × I 4 = 12 | Nível 3/5 — Moderado.</w:t>
-      </w:r>
-    </w:p>
-    <w:p>
-      <w:pPr>
-        <w:pStyle w:val="Detail"/>
-      </w:pPr>
-      <w:r>
-        <w:rPr>
-          <w:b/>
-        </w:rPr>
-        <w:t xml:space="preserve">Evidência e análise: </w:t>
-      </w:r>
-      <w:r>
-        <w:t xml:space="preserve">Limitações de desenho observadas; carga real não medida. Uma trava global serializa as escritas da agenda de todos os profissionais. Listas de clientes, comentários e agendamentos não têm paginação; fotos são armazenadas e retornadas em base64. O crescimento pode elevar espera, tráfego e consumo de memória.</w:t>
-      </w:r>
-    </w:p>
-    <w:p>
-      <w:pPr>
-        <w:pStyle w:val="Detail"/>
-      </w:pPr>
-      <w:r>
-        <w:rPr>
-          <w:b/>
-        </w:rPr>
-        <w:t xml:space="preserve">Controles existentes: </w:t>
-      </w:r>
-      <w:r>
-        <w:t xml:space="preserve">Índices no banco, pool de conexões e limite de tamanho do JSON.</w:t>
+        <w:t xml:space="preserve">Confiabilidade da interface | P 4 × I 3 = 12 | Nível 3/5 — Moderado.</w:t>
+      </w:r>
+    </w:p>
+    <w:p>
+      <w:pPr>
+        <w:pStyle w:val="Detail"/>
+      </w:pPr>
+      <w:r>
+        <w:rPr>
+          <w:b/>
+        </w:rPr>
+        <w:t xml:space="preserve">Cenário potencial: Se falhas de comunicação forem apresentadas como listas vazias ou disponibilidade confirmada, usuários poderão interpretar incorretamente a agenda ou repetir operações.</w:t>
+      </w:r>
+      <w:r>
+        <w:t xml:space="preserve"/>
+      </w:r>
+    </w:p>
+    <w:p>
+      <w:pPr>
+        <w:pStyle w:val="Detail"/>
+      </w:pPr>
+      <w:r>
+        <w:rPr>
+          <w:b/>
+        </w:rPr>
+        <w:t xml:space="preserve">Controles preventivos a considerar: Prever estados distintos de carregamento, ausência e erro, revalidação no servidor e recuperação controlada de falhas.</w:t>
+      </w:r>
+      <w:r>
+        <w:t xml:space="preserve"/>
       </w:r>
     </w:p>
     <w:p>
@@ -4407,7 +4913,7 @@
         <w:t xml:space="preserve">Resposta recomendada: </w:t>
       </w:r>
       <w:r>
-        <w:t xml:space="preserve">Mitigar: medir carga representativa; paginar e filtrar no servidor; limitar campos retornados; avaliar armazenamento de imagens separado. Refinar travas por profissional/dia somente com ordem de aquisição e testes de concorrência.</w:t>
+        <w:t xml:space="preserve">Mitigar: distinguir carregando/vazio/erro, preservar último estado válido com indicação, impedir reserva sem disponibilidade confirmada e usar timeout e repetição controlada em leituras. Tratar 401 separadamente de falha de rede.</w:t>
       </w:r>
     </w:p>
     <w:p>
@@ -4421,7 +4927,7 @@
         <w:t xml:space="preserve">Contingência: </w:t>
       </w:r>
       <w:r>
-        <w:t xml:space="preserve">Reduzir operações em lote e volume retornado; ampliar capacidade conforme medição, preservando as proteções contra conflito.</w:t>
+        <w:t xml:space="preserve">Exibir indisponibilidade e opção de tentar novamente; conferir a reserva antes de reenviar uma operação de escrita.</w:t>
       </w:r>
     </w:p>
     <w:p>
@@ -4435,7 +4941,127 @@
         <w:t xml:space="preserve">Monitoramento e gatilho: </w:t>
       </w:r>
       <w:r>
-        <w:t xml:space="preserve">Semanalmente e em pico: latência p95, espera de locks, conexões e tamanho das respostas. Alertar se p95 superar 2 segundos por 10 minutos ou pool ficar saturado.</w:t>
+        <w:t xml:space="preserve">A cada versão: simular timeout, 500 e desconexão. Diariamente: taxa de NETWORK_ERROR. Alertar acima de 2% por 15 minutos ou se erro aparecer como agenda vazia.</w:t>
+      </w:r>
+    </w:p>
+    <w:p>
+      <w:pPr>
+        <w:pStyle w:val="Detail"/>
+      </w:pPr>
+      <w:r>
+        <w:rPr>
+          <w:b/>
+        </w:rPr>
+        <w:t xml:space="preserve">Responsável / prazo: Frontend e qualidade / Antes de liberar os fluxos de consulta e reserva.</w:t>
+      </w:r>
+      <w:r>
+        <w:t xml:space="preserve"/>
+      </w:r>
+    </w:p>
+    <w:p>
+      <w:pPr>
+        <w:pStyle w:val="Detail"/>
+      </w:pPr>
+      <w:r>
+        <w:rPr>
+          <w:b/>
+        </w:rPr>
+        <w:t xml:space="preserve">Validação futura: verificar o cenário e a eficácia dos controles no ambiente de homologação e registrar os resultados antes de confirmar a classificação.</w:t>
+      </w:r>
+      <w:r>
+        <w:t xml:space="preserve"/>
+      </w:r>
+    </w:p>
+    <w:p>
+      <w:pPr>
+        <w:pStyle w:val="Heading2"/>
+      </w:pPr>
+      <w:r>
+        <w:t xml:space="preserve">R14 • Horários incorretos por fuso e calendário incompleto</w:t>
+      </w:r>
+    </w:p>
+    <w:p>
+      <w:pPr>
+        <w:pStyle w:val="Detail"/>
+      </w:pPr>
+      <w:r>
+        <w:rPr>
+          <w:b/>
+        </w:rPr>
+        <w:t xml:space="preserve">Classificação: </w:t>
+      </w:r>
+      <w:r>
+        <w:t xml:space="preserve">Regras de negócio | P 3 × I 3 = 9 | Nível 3/5 — Moderado.</w:t>
+      </w:r>
+    </w:p>
+    <w:p>
+      <w:pPr>
+        <w:pStyle w:val="Detail"/>
+      </w:pPr>
+      <w:r>
+        <w:rPr>
+          <w:b/>
+        </w:rPr>
+        <w:t xml:space="preserve">Cenário potencial: Diferenças de fuso, relógio ou calendário de feriados e ausências poderão gerar horários incorretos ou reservas em períodos sem atendimento.</w:t>
+      </w:r>
+      <w:r>
+        <w:t xml:space="preserve"/>
+      </w:r>
+    </w:p>
+    <w:p>
+      <w:pPr>
+        <w:pStyle w:val="Detail"/>
+      </w:pPr>
+      <w:r>
+        <w:rPr>
+          <w:b/>
+        </w:rPr>
+        <w:t xml:space="preserve">Controles preventivos a considerar: Definir uma referência de horário, exceções de calendário e sincronização das informações exibidas ao público.</w:t>
+      </w:r>
+      <w:r>
+        <w:t xml:space="preserve"/>
+      </w:r>
+    </w:p>
+    <w:p>
+      <w:pPr>
+        <w:pStyle w:val="Detail"/>
+      </w:pPr>
+      <w:r>
+        <w:rPr>
+          <w:b/>
+        </w:rPr>
+        <w:t xml:space="preserve">Resposta recomendada: </w:t>
+      </w:r>
+      <w:r>
+        <w:t xml:space="preserve">Mitigar: centralizar disponibilidade e horário de referência no backend; incluir exceções por data, pausas e ausências; exibir o fuso e sincronizar informações públicas com a configuração.</w:t>
+      </w:r>
+    </w:p>
+    <w:p>
+      <w:pPr>
+        <w:pStyle w:val="Detail"/>
+      </w:pPr>
+      <w:r>
+        <w:rPr>
+          <w:b/>
+        </w:rPr>
+        <w:t xml:space="preserve">Contingência: </w:t>
+      </w:r>
+      <w:r>
+        <w:t xml:space="preserve">Bloquear reservas afetadas por operação controlada e oferecer remarcação aos clientes.</w:t>
+      </w:r>
+    </w:p>
+    <w:p>
+      <w:pPr>
+        <w:pStyle w:val="Detail"/>
+      </w:pPr>
+      <w:r>
+        <w:rPr>
+          <w:b/>
+        </w:rPr>
+        <w:t xml:space="preserve">Monitoramento e gatilho: </w:t>
+      </w:r>
+      <w:r>
+        <w:t xml:space="preserve">Semanalmente e antes de feriados: comparar calendário público, agenda e configurações. Em cada versão: testar virada do dia e navegador em outro fuso. Limite: zero divergência no cenário validado.</w:t>
       </w:r>
     </w:p>
     <w:p>
@@ -4449,21 +5075,34 @@
         <w:t xml:space="preserve">Responsável / prazo: </w:t>
       </w:r>
       <w:r>
-        <w:t xml:space="preserve">Backend e infraestrutura / Antes de ampliar número de usuários.</w:t>
-      </w:r>
-    </w:p>
-    <w:p>
-      <w:pPr>
-        <w:pStyle w:val="Detail"/>
-      </w:pPr>
-      <w:r>
-        <w:rPr>
-          <w:b/>
-        </w:rPr>
-        <w:t xml:space="preserve">Referências locais: </w:t>
-      </w:r>
-      <w:r>
-        <w:t xml:space="preserve">backend/bookings.js: lockAgenda; backend/app.js: listagens; backend/db.js; js/app.js.</w:t>
+        <w:t xml:space="preserve">Backend, frontend e administrador / Antes do próximo feriado ou mudança de horário.</w:t>
+      </w:r>
+    </w:p>
+    <w:p>
+      <w:pPr>
+        <w:pStyle w:val="Detail"/>
+      </w:pPr>
+      <w:r>
+        <w:rPr>
+          <w:b/>
+        </w:rPr>
+        <w:t xml:space="preserve">Validação futura: verificar o cenário e a eficácia dos controles no ambiente de homologação e registrar os resultados antes de confirmar a classificação.</w:t>
+      </w:r>
+      <w:r>
+        <w:t xml:space="preserve"/>
+      </w:r>
+    </w:p>
+    <w:p>
+      <w:r>
+        <w:br w:type="page"/>
+      </w:r>
+    </w:p>
+    <w:p>
+      <w:pPr>
+        <w:pStyle w:val="Heading1"/>
+      </w:pPr>
+      <w:r>
+        <w:t xml:space="preserve">5. Análise e resposta por risco — continuação</w:t>
       </w:r>
     </w:p>
     <w:p>
@@ -4471,7 +5110,7 @@
         <w:pStyle w:val="Heading2"/>
       </w:pPr>
       <w:r>
-        <w:t xml:space="preserve">R10 • Reservas sobrepostas por escrita fora da API</w:t>
+        <w:t xml:space="preserve">R15 • Fluxos inacessíveis por teclado ou falha de animação</w:t>
       </w:r>
     </w:p>
     <w:p>
@@ -4485,35 +5124,35 @@
         <w:t xml:space="preserve">Classificação: </w:t>
       </w:r>
       <w:r>
-        <w:t xml:space="preserve">Integridade | P 2 × I 4 = 8 | Nível 2/5 — Baixo.</w:t>
-      </w:r>
-    </w:p>
-    <w:p>
-      <w:pPr>
-        <w:pStyle w:val="Detail"/>
-      </w:pPr>
-      <w:r>
-        <w:rPr>
-          <w:b/>
-        </w:rPr>
-        <w:t xml:space="preserve">Evidência e análise: </w:t>
-      </w:r>
-      <w:r>
-        <w:t xml:space="preserve">Limite de proteção documentado e confirmado no esquema. A API verifica intervalos sob trava, mas o índice único impede apenas o mesmo horario_id ativo. Uma escrita direta no banco pode inserir horários distintos com intervalos sobrepostos, sem processar a fila.</w:t>
-      </w:r>
-    </w:p>
-    <w:p>
-      <w:pPr>
-        <w:pStyle w:val="Detail"/>
-      </w:pPr>
-      <w:r>
-        <w:rPr>
-          <w:b/>
-        </w:rPr>
-        <w:t xml:space="preserve">Controles existentes: </w:t>
-      </w:r>
-      <w:r>
-        <w:t xml:space="preserve">Transações, trava global, verificação de intervalos e unicidade de horário ativo protegem o fluxo normal da API.</w:t>
+        <w:t xml:space="preserve">Acessibilidade e usabilidade | P 4 × I 3 = 12 | Nível 3/5 — Moderado.</w:t>
+      </w:r>
+    </w:p>
+    <w:p>
+      <w:pPr>
+        <w:pStyle w:val="Detail"/>
+      </w:pPr>
+      <w:r>
+        <w:rPr>
+          <w:b/>
+        </w:rPr>
+        <w:t xml:space="preserve">Cenário potencial: Se controles dependerem de mouse ou conteúdo depender de animações, pessoas que usam teclado, leitor de tela ou ambientes com falhas de script poderão não concluir tarefas.</w:t>
+      </w:r>
+      <w:r>
+        <w:t xml:space="preserve"/>
+      </w:r>
+    </w:p>
+    <w:p>
+      <w:pPr>
+        <w:pStyle w:val="Detail"/>
+      </w:pPr>
+      <w:r>
+        <w:rPr>
+          <w:b/>
+        </w:rPr>
+        <w:t xml:space="preserve">Controles preventivos a considerar: Prever controles acessíveis, gestão de foco, conteúdo disponível sem animações e validação das jornadas essenciais.</w:t>
+      </w:r>
+      <w:r>
+        <w:t xml:space="preserve"/>
       </w:r>
     </w:p>
     <w:p>
@@ -4527,7 +5166,7 @@
         <w:t xml:space="preserve">Resposta recomendada: </w:t>
       </w:r>
       <w:r>
-        <w:t xml:space="preserve">Evitar escritas manuais de agenda: restringir permissões e usar operações controladas. Avaliar restrição de exclusão por intervalo no banco e testes de importação.</w:t>
+        <w:t xml:space="preserve">Mitigar: manter controles focáveis, dar nomes e estados acessíveis, gerir foco e visibilidade; oferecer conteúdo visível quando animações falharem e respeitar movimento reduzido. Testar os fluxos com teclado e leitor de tela.</w:t>
       </w:r>
     </w:p>
     <w:p>
@@ -4541,7 +5180,7 @@
         <w:t xml:space="preserve">Contingência: </w:t>
       </w:r>
       <w:r>
-        <w:t xml:space="preserve">Bloquear a rotina causadora; identificar os clientes afetados e ajustar a agenda com registro da decisão.</w:t>
+        <w:t xml:space="preserve">Disponibilizar apoio de atendimento e corrigir primeiro os bloqueios de cadastro e reserva.</w:t>
       </w:r>
     </w:p>
     <w:p>
@@ -4555,7 +5194,7 @@
         <w:t xml:space="preserve">Monitoramento e gatilho: </w:t>
       </w:r>
       <w:r>
-        <w:t xml:space="preserve">Diariamente e após importação: consulta de intervalos ativos sobrepostos por profissional/data. Limite: zero; revisar acessos de escrita mensalmente.</w:t>
+        <w:t xml:space="preserve">A cada versão: concluir cadastro, reserva, avaliação e administração sem mouse; verificar zoom de 200% e celular. Qualquer tarefa essencial impossível bloqueia a entrega.</w:t>
       </w:r>
     </w:p>
     <w:p>
@@ -4569,21 +5208,141 @@
         <w:t xml:space="preserve">Responsável / prazo: </w:t>
       </w:r>
       <w:r>
-        <w:t xml:space="preserve">Responsável pelo banco e backend / Antes de integrações ou importações.</w:t>
-      </w:r>
-    </w:p>
-    <w:p>
-      <w:pPr>
-        <w:pStyle w:val="Detail"/>
-      </w:pPr>
-      <w:r>
-        <w:rPr>
-          <w:b/>
-        </w:rPr>
-        <w:t xml:space="preserve">Referências locais: </w:t>
-      </w:r>
-      <w:r>
-        <w:t xml:space="preserve">backend/schema.sql: agendamento_horario_ativo; backend/bookings.js: conflict/lockAgenda; backend/README.md.</w:t>
+        <w:t xml:space="preserve">Frontend e qualidade / Próxima entrega de interface.</w:t>
+      </w:r>
+    </w:p>
+    <w:p>
+      <w:pPr>
+        <w:pStyle w:val="Detail"/>
+      </w:pPr>
+      <w:r>
+        <w:rPr>
+          <w:b/>
+        </w:rPr>
+        <w:t xml:space="preserve">Validação futura: verificar o cenário e a eficácia dos controles no ambiente de homologação e registrar os resultados antes de confirmar a classificação.</w:t>
+      </w:r>
+      <w:r>
+        <w:t xml:space="preserve"/>
+      </w:r>
+    </w:p>
+    <w:p>
+      <w:pPr>
+        <w:pStyle w:val="Heading2"/>
+      </w:pPr>
+      <w:r>
+        <w:t xml:space="preserve">R16 • Incidentes detectados tarde e suporte sem diagnóstico</w:t>
+      </w:r>
+    </w:p>
+    <w:p>
+      <w:pPr>
+        <w:pStyle w:val="Detail"/>
+      </w:pPr>
+      <w:r>
+        <w:rPr>
+          <w:b/>
+        </w:rPr>
+        <w:t xml:space="preserve">Classificação: </w:t>
+      </w:r>
+      <w:r>
+        <w:t xml:space="preserve">Operação | P 3 × I 4 = 12 | Nível 3/5 — Moderado.</w:t>
+      </w:r>
+    </w:p>
+    <w:p>
+      <w:pPr>
+        <w:pStyle w:val="Detail"/>
+      </w:pPr>
+      <w:r>
+        <w:rPr>
+          <w:b/>
+        </w:rPr>
+        <w:t xml:space="preserve">Cenário potencial: Se alertas, registros de diagnóstico e processos de suporte forem insuficientes, indisponibilidades e problemas de acesso poderão demorar a ser detectados e resolvidos.</w:t>
+      </w:r>
+      <w:r>
+        <w:t xml:space="preserve"/>
+      </w:r>
+    </w:p>
+    <w:p>
+      <w:pPr>
+        <w:pStyle w:val="Detail"/>
+      </w:pPr>
+      <w:r>
+        <w:rPr>
+          <w:b/>
+        </w:rPr>
+        <w:t xml:space="preserve">Controles preventivos a considerar: Planejar verificações de saúde, registros sem segredos, alertas e procedimentos seguros de suporte e recuperação de acesso.</w:t>
+      </w:r>
+      <w:r>
+        <w:t xml:space="preserve"/>
+      </w:r>
+    </w:p>
+    <w:p>
+      <w:pPr>
+        <w:pStyle w:val="Detail"/>
+      </w:pPr>
+      <w:r>
+        <w:rPr>
+          <w:b/>
+        </w:rPr>
+        <w:t xml:space="preserve">Resposta recomendada: </w:t>
+      </w:r>
+      <w:r>
+        <w:t xml:space="preserve">Mitigar: implantar monitoramento externo, logs com correlação sem segredos e roteiro de incidentes. Implementar recuperação segura de acesso com token temporário, uso único e revogação de sessões quando cabível.</w:t>
+      </w:r>
+    </w:p>
+    <w:p>
+      <w:pPr>
+        <w:pStyle w:val="Detail"/>
+      </w:pPr>
+      <w:r>
+        <w:rPr>
+          <w:b/>
+        </w:rPr>
+        <w:t xml:space="preserve">Contingência: </w:t>
+      </w:r>
+      <w:r>
+        <w:t xml:space="preserve">Designar responsável de plantão, seguir diagnóstico API/banco e validar identidade antes de recuperar uma conta.</w:t>
+      </w:r>
+    </w:p>
+    <w:p>
+      <w:pPr>
+        <w:pStyle w:val="Detail"/>
+      </w:pPr>
+      <w:r>
+        <w:rPr>
+          <w:b/>
+        </w:rPr>
+        <w:t xml:space="preserve">Monitoramento e gatilho: </w:t>
+      </w:r>
+      <w:r>
+        <w:t xml:space="preserve">Contínuo: alertar após 2 falhas de saúde ou erros 5xx acima de 1% por 5 minutos. Mensalmente: simular indisponibilidade e perda de senha e medir tempo de resposta.</w:t>
+      </w:r>
+    </w:p>
+    <w:p>
+      <w:pPr>
+        <w:pStyle w:val="Detail"/>
+      </w:pPr>
+      <w:r>
+        <w:rPr>
+          <w:b/>
+        </w:rPr>
+        <w:t xml:space="preserve">Responsável / prazo: </w:t>
+      </w:r>
+      <w:r>
+        <w:t xml:space="preserve">Infraestrutura, backend e atendimento / Antes da operação pública.</w:t>
+      </w:r>
+    </w:p>
+    <w:p>
+      <w:pPr>
+        <w:pStyle w:val="Detail"/>
+      </w:pPr>
+      <w:r>
+        <w:rPr>
+          <w:b/>
+        </w:rPr>
+        <w:t xml:space="preserve">Validação futura: verificar o cenário e a eficácia dos controles no ambiente de homologação e registrar os resultados antes de confirmar a classificação.</w:t>
+      </w:r>
+      <w:r>
+        <w:t xml:space="preserve"/>
       </w:r>
     </w:p>
     <w:p>
@@ -4604,7 +5363,7 @@
         <w:pStyle w:val="Heading2"/>
       </w:pPr>
       <w:r>
-        <w:t xml:space="preserve">R11 • Histórico e indicadores alterados sem rastreabilidade</w:t>
+        <w:t xml:space="preserve">R17 • Abuso de reservas e sobrecarga de moderação</w:t>
       </w:r>
     </w:p>
     <w:p>
@@ -4618,35 +5377,35 @@
         <w:t xml:space="preserve">Classificação: </w:t>
       </w:r>
       <w:r>
-        <w:t xml:space="preserve">Operação e informação gerencial | P 3 × I 4 = 12 | Nível 3/5 — Moderado.</w:t>
-      </w:r>
-    </w:p>
-    <w:p>
-      <w:pPr>
-        <w:pStyle w:val="Detail"/>
-      </w:pPr>
-      <w:r>
-        <w:rPr>
-          <w:b/>
-        </w:rPr>
-        <w:t xml:space="preserve">Evidência e análise: </w:t>
-      </w:r>
-      <w:r>
-        <w:t xml:space="preserve">Possibilidades observadas nas rotas administrativas. O administrador pode excluir agendamentos e mudar seus status, inclusive entre estados encerrados, sem trilha de auditoria. O indicador Faturado soma serviços concluídos, sem registro de pagamento. Exclusões ou status incorretos podem distorcer acompanhamento e gerar disputas.</w:t>
-      </w:r>
-    </w:p>
-    <w:p>
-      <w:pPr>
-        <w:pStyle w:val="Detail"/>
-      </w:pPr>
-      <w:r>
-        <w:rPr>
-          <w:b/>
-        </w:rPr>
-        <w:t xml:space="preserve">Controles existentes: </w:t>
-      </w:r>
-      <w:r>
-        <w:t xml:space="preserve">Acesso restrito ao administrador; confirmação na interface; valor e duração históricos preservados nas reservas.</w:t>
+        <w:t xml:space="preserve">Operação e reputação | P 3 × I 3 = 9 | Nível 3/5 — Moderado.</w:t>
+      </w:r>
+    </w:p>
+    <w:p>
+      <w:pPr>
+        <w:pStyle w:val="Detail"/>
+      </w:pPr>
+      <w:r>
+        <w:rPr>
+          <w:b/>
+        </w:rPr>
+        <w:t xml:space="preserve">Cenário potencial: Usuários poderão ocupar muitos horários ou enviar avaliações em excesso, reduzindo a disponibilidade e aumentando o esforço de moderação se as regras forem insuficientes.</w:t>
+      </w:r>
+      <w:r>
+        <w:t xml:space="preserve"/>
+      </w:r>
+    </w:p>
+    <w:p>
+      <w:pPr>
+        <w:pStyle w:val="Detail"/>
+      </w:pPr>
+      <w:r>
+        <w:rPr>
+          <w:b/>
+        </w:rPr>
+        <w:t xml:space="preserve">Controles preventivos a considerar: Definir limites proporcionais ao uso legítimo, critérios de avaliação e acompanhamento de atividades suspeitas.</w:t>
+      </w:r>
+      <w:r>
+        <w:t xml:space="preserve"/>
       </w:r>
     </w:p>
     <w:p>
@@ -4660,7 +5419,7 @@
         <w:t xml:space="preserve">Resposta recomendada: </w:t>
       </w:r>
       <w:r>
-        <w:t xml:space="preserve">Mitigar: preferir cancelamento/arquivamento, registrar autor/data/motivo e mudanças, definir transições permitidas e distinguir serviço concluído de pagamento recebido.</w:t>
+        <w:t xml:space="preserve">Mitigar: acordar limites de reservas futuras e comentários, aplicar limitação de requisições por usuário e regra de avaliação vinculada a atendimento se fizer sentido para o negócio.</w:t>
       </w:r>
     </w:p>
     <w:p>
@@ -4674,7 +5433,7 @@
         <w:t xml:space="preserve">Contingência: </w:t>
       </w:r>
       <w:r>
-        <w:t xml:space="preserve">Reconciliar histórico com registros de atendimento; corrigir por operação auditada, preservando evidências.</w:t>
+        <w:t xml:space="preserve">Revisar atividade suspeita, revogar sessões e cancelar registros abusivos com justificativa e possibilidade de revisão.</w:t>
       </w:r>
     </w:p>
     <w:p>
@@ -4688,7 +5447,7 @@
         <w:t xml:space="preserve">Monitoramento e gatilho: </w:t>
       </w:r>
       <w:r>
-        <w:t xml:space="preserve">Diariamente: revisar exclusões, mudanças de status encerrado e divergências com atendimentos. Qualquer exclusão sem justificativa ou diferença não explicada exige revisão.</w:t>
+        <w:t xml:space="preserve">Diariamente: alertar por mais de 5 reservas futuras ou 10 comentários de um usuário em 24 horas; revisar esses limiares após medir uso legítimo. Acompanhar pendências de moderação acima de 48 horas.</w:t>
       </w:r>
     </w:p>
     <w:p>
@@ -4702,21 +5461,21 @@
         <w:t xml:space="preserve">Responsável / prazo: </w:t>
       </w:r>
       <w:r>
-        <w:t xml:space="preserve">Gestor da barbearia e backend / Antes de usar o painel como controle gerencial.</w:t>
-      </w:r>
-    </w:p>
-    <w:p>
-      <w:pPr>
-        <w:pStyle w:val="Detail"/>
-      </w:pPr>
-      <w:r>
-        <w:rPr>
-          <w:b/>
-        </w:rPr>
-        <w:t xml:space="preserve">Referências locais: </w:t>
-      </w:r>
-      <w:r>
-        <w:t xml:space="preserve">backend/app.js: changeStatus e DELETE /api/agendamentos/:id; js/app.js: updateStats/handleDelete.</w:t>
+        <w:t xml:space="preserve">Backend e administrador / Primeiro ciclo de melhoria operacional.</w:t>
+      </w:r>
+    </w:p>
+    <w:p>
+      <w:pPr>
+        <w:pStyle w:val="Detail"/>
+      </w:pPr>
+      <w:r>
+        <w:rPr>
+          <w:b/>
+        </w:rPr>
+        <w:t xml:space="preserve">Validação futura: verificar o cenário e a eficácia dos controles no ambiente de homologação e registrar os resultados antes de confirmar a classificação.</w:t>
+      </w:r>
+      <w:r>
+        <w:t xml:space="preserve"/>
       </w:r>
     </w:p>
     <w:p>
@@ -4724,7 +5483,7 @@
         <w:pStyle w:val="Heading2"/>
       </w:pPr>
       <w:r>
-        <w:t xml:space="preserve">R12 • Dados pessoais sem ciclo de tratamento definido</w:t>
+        <w:t xml:space="preserve">R18 • Manutenção difícil e dependências sem rotina de revisão</w:t>
       </w:r>
     </w:p>
     <w:p>
@@ -4738,49 +5497,49 @@
         <w:t xml:space="preserve">Classificação: </w:t>
       </w:r>
       <w:r>
-        <w:t xml:space="preserve">Privacidade e governança | P 3 × I 4 = 12 | Nível 3/5 — Moderado.</w:t>
-      </w:r>
-    </w:p>
-    <w:p>
-      <w:pPr>
-        <w:pStyle w:val="Detail"/>
-      </w:pPr>
-      <w:r>
-        <w:rPr>
-          <w:b/>
-        </w:rPr>
-        <w:t xml:space="preserve">Evidência e análise: </w:t>
-      </w:r>
-      <w:r>
-        <w:t xml:space="preserve">Ausência de política/fluxo nos arquivos; procedimentos externos não avaliados. O sistema guarda nome, e-mail, telefone, foto, observações e histórico. Não foram encontrados prazo de retenção, aviso de privacidade ou fluxo de anonimização/exportação. Exclusão de cliente com histórico é bloqueada por vínculos; comentários aprovados expõem nome e userId.</w:t>
-      </w:r>
-    </w:p>
-    <w:p>
-      <w:pPr>
-        <w:pStyle w:val="Detail"/>
-      </w:pPr>
-      <w:r>
-        <w:rPr>
-          <w:b/>
-        </w:rPr>
-        <w:t xml:space="preserve">Controles existentes: </w:t>
-      </w:r>
-      <w:r>
-        <w:t xml:space="preserve">Clientes só consultam suas reservas; lista de usuários restrita ao administrador; comentários dependem de aprovação.</w:t>
-      </w:r>
-    </w:p>
-    <w:p>
-      <w:pPr>
-        <w:pStyle w:val="Detail"/>
-      </w:pPr>
-      <w:r>
-        <w:rPr>
-          <w:b/>
-        </w:rPr>
-        <w:t xml:space="preserve">Resposta recomendada: </w:t>
-      </w:r>
-      <w:r>
-        <w:t xml:space="preserve">Mitigar: inventariar dados e finalidades; minimizar campos públicos; definir retenção, acesso e tratamento de solicitações com anonimização compatível com histórico. Validar os requisitos aplicáveis com o responsável pela privacidade.</w:t>
+        <w:t xml:space="preserve">Evolução e prazo | P 3 × I 3 = 9 | Nível 3/5 — Moderado.</w:t>
+      </w:r>
+    </w:p>
+    <w:p>
+      <w:pPr>
+        <w:pStyle w:val="Detail"/>
+      </w:pPr>
+      <w:r>
+        <w:rPr>
+          <w:b/>
+        </w:rPr>
+        <w:t xml:space="preserve">Cenário potencial: Se módulos, documentação e dependências evoluírem sem revisão regular, alterações poderão exigir esforço crescente, provocar regressões ou manter componentes desatualizados.</w:t>
+      </w:r>
+      <w:r>
+        <w:t xml:space="preserve"/>
+      </w:r>
+    </w:p>
+    <w:p>
+      <w:pPr>
+        <w:pStyle w:val="Detail"/>
+      </w:pPr>
+      <w:r>
+        <w:rPr>
+          <w:b/>
+        </w:rPr>
+        <w:t xml:space="preserve">Controles preventivos a considerar: Planejar modularidade, documentação, controle de versões e rotina de revisão de dependências e manutenção.</w:t>
+      </w:r>
+      <w:r>
+        <w:t xml:space="preserve"/>
+      </w:r>
+    </w:p>
+    <w:p>
+      <w:pPr>
+        <w:pStyle w:val="Detail"/>
+      </w:pPr>
+      <w:r>
+        <w:rPr>
+          <w:b/>
+        </w:rPr>
+        <w:t xml:space="preserve">Resposta recomendada: Mitigar: organizar módulos por funcionalidade, revisar componentes sem uso quando houver, manter documentação e dependências atualizadas e reservar capacidade de manutenção no planejamento.</w:t>
+      </w:r>
+      <w:r>
+        <w:t xml:space="preserve"/>
       </w:r>
     </w:p>
     <w:p>
@@ -4794,7 +5553,7 @@
         <w:t xml:space="preserve">Contingência: </w:t>
       </w:r>
       <w:r>
-        <w:t xml:space="preserve">Conter exposição, preservar evidências e encaminhar o incidente ao responsável pelo tratamento de dados.</w:t>
+        <w:t xml:space="preserve">Reverter atualização problemática, fixar versão validada e priorizar correção conforme impacto comprovado.</w:t>
       </w:r>
     </w:p>
     <w:p>
@@ -4808,7 +5567,7 @@
         <w:t xml:space="preserve">Monitoramento e gatilho: </w:t>
       </w:r>
       <w:r>
-        <w:t xml:space="preserve">Mensalmente: revisar campos públicos, acessos e registros vencidos. Limite: zero campo pessoal desnecessário publicado; tratar solicitações no prazo interno definido e monitorado.</w:t>
+        <w:t xml:space="preserve">Mensalmente: revisar dependências, documentação e código sem uso. A cada entrega: registrar retrabalho e falhas reabertas; investigar qualquer alerta de segurança aplicável ou regressão repetida.</w:t>
       </w:r>
     </w:p>
     <w:p>
@@ -4822,21 +5581,21 @@
         <w:t xml:space="preserve">Responsável / prazo: </w:t>
       </w:r>
       <w:r>
-        <w:t xml:space="preserve">Gestão e responsável por privacidade / Antes de coletar dados reais.</w:t>
-      </w:r>
-    </w:p>
-    <w:p>
-      <w:pPr>
-        <w:pStyle w:val="Detail"/>
-      </w:pPr>
-      <w:r>
-        <w:rPr>
-          <w:b/>
-        </w:rPr>
-        <w:t xml:space="preserve">Referências locais: </w:t>
-      </w:r>
-      <w:r>
-        <w:t xml:space="preserve">backend/schema.sql; backend/app.js: userDTO/commentDTO e exclusão de usuários; auth.html; comentarios.html.</w:t>
+        <w:t xml:space="preserve">Liderança técnica e desenvolvimento / Plano de evolução de até 60 dias.</w:t>
+      </w:r>
+    </w:p>
+    <w:p>
+      <w:pPr>
+        <w:pStyle w:val="Detail"/>
+      </w:pPr>
+      <w:r>
+        <w:rPr>
+          <w:b/>
+        </w:rPr>
+        <w:t xml:space="preserve">Validação futura: verificar o cenário e a eficácia dos controles no ambiente de homologação e registrar os resultados antes de confirmar a classificação.</w:t>
+      </w:r>
+      <w:r>
+        <w:t xml:space="preserve"/>
       </w:r>
     </w:p>
     <w:p>
@@ -4849,765 +5608,6 @@
         <w:pStyle w:val="Heading1"/>
       </w:pPr>
       <w:r>
-        <w:t xml:space="preserve">5. Análise e resposta por risco — continuação</w:t>
-      </w:r>
-    </w:p>
-    <w:p>
-      <w:pPr>
-        <w:pStyle w:val="Heading2"/>
-      </w:pPr>
-      <w:r>
-        <w:t xml:space="preserve">R13 • Falhas de rede confundidas com ausência de dados</w:t>
-      </w:r>
-    </w:p>
-    <w:p>
-      <w:pPr>
-        <w:pStyle w:val="Detail"/>
-      </w:pPr>
-      <w:r>
-        <w:rPr>
-          <w:b/>
-        </w:rPr>
-        <w:t xml:space="preserve">Classificação: </w:t>
-      </w:r>
-      <w:r>
-        <w:t xml:space="preserve">Confiabilidade da interface | P 4 × I 3 = 12 | Nível 3/5 — Moderado.</w:t>
-      </w:r>
-    </w:p>
-    <w:p>
-      <w:pPr>
-        <w:pStyle w:val="Detail"/>
-      </w:pPr>
-      <w:r>
-        <w:rPr>
-          <w:b/>
-        </w:rPr>
-        <w:t xml:space="preserve">Evidência e análise: </w:t>
-      </w:r>
-      <w:r>
-        <w:t xml:space="preserve">Tratamento observado no cliente REST e nos carregamentos. request usa fetch sem timeout explícito. Ao falhar, loadSlots zera a cache e loadServices/loadBarbeiros retornam listas vazias; isso pode sugerir horários livres ou cadastro inexistente. Erros ao consultar a sessão podem ser tratados como sessão inválida mesmo em falha temporária.</w:t>
-      </w:r>
-    </w:p>
-    <w:p>
-      <w:pPr>
-        <w:pStyle w:val="Detail"/>
-      </w:pPr>
-      <w:r>
-        <w:rPr>
-          <w:b/>
-        </w:rPr>
-        <w:t xml:space="preserve">Controles existentes: </w:t>
-      </w:r>
-      <w:r>
-        <w:t xml:space="preserve">Mensagens de erro em parte dos fluxos; o servidor revalida disponibilidade e impede dupla reserva pela API.</w:t>
-      </w:r>
-    </w:p>
-    <w:p>
-      <w:pPr>
-        <w:pStyle w:val="Detail"/>
-      </w:pPr>
-      <w:r>
-        <w:rPr>
-          <w:b/>
-        </w:rPr>
-        <w:t xml:space="preserve">Resposta recomendada: </w:t>
-      </w:r>
-      <w:r>
-        <w:t xml:space="preserve">Mitigar: distinguir carregando/vazio/erro, preservar último estado válido com indicação, impedir reserva sem disponibilidade confirmada e usar timeout e repetição controlada em leituras. Tratar 401 separadamente de falha de rede.</w:t>
-      </w:r>
-    </w:p>
-    <w:p>
-      <w:pPr>
-        <w:pStyle w:val="Detail"/>
-      </w:pPr>
-      <w:r>
-        <w:rPr>
-          <w:b/>
-        </w:rPr>
-        <w:t xml:space="preserve">Contingência: </w:t>
-      </w:r>
-      <w:r>
-        <w:t xml:space="preserve">Exibir indisponibilidade e opção de tentar novamente; conferir a reserva antes de reenviar uma operação de escrita.</w:t>
-      </w:r>
-    </w:p>
-    <w:p>
-      <w:pPr>
-        <w:pStyle w:val="Detail"/>
-      </w:pPr>
-      <w:r>
-        <w:rPr>
-          <w:b/>
-        </w:rPr>
-        <w:t xml:space="preserve">Monitoramento e gatilho: </w:t>
-      </w:r>
-      <w:r>
-        <w:t xml:space="preserve">A cada versão: simular timeout, 500 e desconexão. Diariamente: taxa de NETWORK_ERROR. Alertar acima de 2% por 15 minutos ou se erro aparecer como agenda vazia.</w:t>
-      </w:r>
-    </w:p>
-    <w:p>
-      <w:pPr>
-        <w:pStyle w:val="Detail"/>
-      </w:pPr>
-      <w:r>
-        <w:rPr>
-          <w:b/>
-        </w:rPr>
-        <w:t xml:space="preserve">Responsável / prazo: </w:t>
-      </w:r>
-      <w:r>
-        <w:t xml:space="preserve">Frontend e qualidade / Próxima correção de interface.</w:t>
-      </w:r>
-    </w:p>
-    <w:p>
-      <w:pPr>
-        <w:pStyle w:val="Detail"/>
-      </w:pPr>
-      <w:r>
-        <w:rPr>
-          <w:b/>
-        </w:rPr>
-        <w:t xml:space="preserve">Referências locais: </w:t>
-      </w:r>
-      <w:r>
-        <w:t xml:space="preserve">js/api.js: request; js/app.js: loadSlots/loadServices/loadBarbeiros/initAuth; js/auth.js: loadCurrentUser.</w:t>
-      </w:r>
-    </w:p>
-    <w:p>
-      <w:pPr>
-        <w:pStyle w:val="Heading2"/>
-      </w:pPr>
-      <w:r>
-        <w:t xml:space="preserve">R14 • Horários incorretos por fuso e calendário incompleto</w:t>
-      </w:r>
-    </w:p>
-    <w:p>
-      <w:pPr>
-        <w:pStyle w:val="Detail"/>
-      </w:pPr>
-      <w:r>
-        <w:rPr>
-          <w:b/>
-        </w:rPr>
-        <w:t xml:space="preserve">Classificação: </w:t>
-      </w:r>
-      <w:r>
-        <w:t xml:space="preserve">Regras de negócio | P 3 × I 3 = 9 | Nível 3/5 — Moderado.</w:t>
-      </w:r>
-    </w:p>
-    <w:p>
-      <w:pPr>
-        <w:pStyle w:val="Detail"/>
-      </w:pPr>
-      <w:r>
-        <w:rPr>
-          <w:b/>
-        </w:rPr>
-        <w:t xml:space="preserve">Evidência e análise: </w:t>
-      </w:r>
-      <w:r>
-        <w:t xml:space="preserve">Divergência de fontes de horário e ausência de calendário observadas. O navegador usa seu próprio relógio/fuso; PostgreSQL usa APP_TIMEZONE. Não há calendário de feriados/ausências nem rota de bloqueio manual de horários, embora o banco tenha disponivel. A página Sobre informa feriados fechados e horários fixos que podem divergir dos profissionais.</w:t>
-      </w:r>
-    </w:p>
-    <w:p>
-      <w:pPr>
-        <w:pStyle w:val="Detail"/>
-      </w:pPr>
-      <w:r>
-        <w:rPr>
-          <w:b/>
-        </w:rPr>
-        <w:t xml:space="preserve">Controles existentes: </w:t>
-      </w:r>
-      <w:r>
-        <w:t xml:space="preserve">Backend rejeita horários passados e valida dias e expediente; fuso padrão America/Sao_Paulo.</w:t>
-      </w:r>
-    </w:p>
-    <w:p>
-      <w:pPr>
-        <w:pStyle w:val="Detail"/>
-      </w:pPr>
-      <w:r>
-        <w:rPr>
-          <w:b/>
-        </w:rPr>
-        <w:t xml:space="preserve">Resposta recomendada: </w:t>
-      </w:r>
-      <w:r>
-        <w:t xml:space="preserve">Mitigar: centralizar disponibilidade e horário de referência no backend; incluir exceções por data, pausas e ausências; exibir o fuso e sincronizar informações públicas com a configuração.</w:t>
-      </w:r>
-    </w:p>
-    <w:p>
-      <w:pPr>
-        <w:pStyle w:val="Detail"/>
-      </w:pPr>
-      <w:r>
-        <w:rPr>
-          <w:b/>
-        </w:rPr>
-        <w:t xml:space="preserve">Contingência: </w:t>
-      </w:r>
-      <w:r>
-        <w:t xml:space="preserve">Bloquear reservas afetadas por operação controlada e oferecer remarcação aos clientes.</w:t>
-      </w:r>
-    </w:p>
-    <w:p>
-      <w:pPr>
-        <w:pStyle w:val="Detail"/>
-      </w:pPr>
-      <w:r>
-        <w:rPr>
-          <w:b/>
-        </w:rPr>
-        <w:t xml:space="preserve">Monitoramento e gatilho: </w:t>
-      </w:r>
-      <w:r>
-        <w:t xml:space="preserve">Semanalmente e antes de feriados: comparar calendário público, agenda e configurações. Em cada versão: testar virada do dia e navegador em outro fuso. Limite: zero divergência no cenário validado.</w:t>
-      </w:r>
-    </w:p>
-    <w:p>
-      <w:pPr>
-        <w:pStyle w:val="Detail"/>
-      </w:pPr>
-      <w:r>
-        <w:rPr>
-          <w:b/>
-        </w:rPr>
-        <w:t xml:space="preserve">Responsável / prazo: </w:t>
-      </w:r>
-      <w:r>
-        <w:t xml:space="preserve">Backend, frontend e administrador / Antes do próximo feriado ou mudança de horário.</w:t>
-      </w:r>
-    </w:p>
-    <w:p>
-      <w:pPr>
-        <w:pStyle w:val="Detail"/>
-      </w:pPr>
-      <w:r>
-        <w:rPr>
-          <w:b/>
-        </w:rPr>
-        <w:t xml:space="preserve">Referências locais: </w:t>
-      </w:r>
-      <w:r>
-        <w:t xml:space="preserve">js/app.js: getTodayISO/generateBarberSlots; backend/db.js; backend/bookings.js: prepare; sobre.html.</w:t>
-      </w:r>
-    </w:p>
-    <w:p>
-      <w:r>
-        <w:br w:type="page"/>
-      </w:r>
-    </w:p>
-    <w:p>
-      <w:pPr>
-        <w:pStyle w:val="Heading1"/>
-      </w:pPr>
-      <w:r>
-        <w:t xml:space="preserve">5. Análise e resposta por risco — continuação</w:t>
-      </w:r>
-    </w:p>
-    <w:p>
-      <w:pPr>
-        <w:pStyle w:val="Heading2"/>
-      </w:pPr>
-      <w:r>
-        <w:t xml:space="preserve">R15 • Fluxos inacessíveis por teclado ou falha de animação</w:t>
-      </w:r>
-    </w:p>
-    <w:p>
-      <w:pPr>
-        <w:pStyle w:val="Detail"/>
-      </w:pPr>
-      <w:r>
-        <w:rPr>
-          <w:b/>
-        </w:rPr>
-        <w:t xml:space="preserve">Classificação: </w:t>
-      </w:r>
-      <w:r>
-        <w:t xml:space="preserve">Acessibilidade e usabilidade | P 4 × I 3 = 12 | Nível 3/5 — Moderado.</w:t>
-      </w:r>
-    </w:p>
-    <w:p>
-      <w:pPr>
-        <w:pStyle w:val="Detail"/>
-      </w:pPr>
-      <w:r>
-        <w:rPr>
-          <w:b/>
-        </w:rPr>
-        <w:t xml:space="preserve">Evidência e análise: </w:t>
-      </w:r>
-      <w:r>
-        <w:t xml:space="preserve">Barreiras identificadas no código; avaliação com usuários pendente. Rádios de serviços e caixas de dias usam display:none; estrelas dependem de cliques em labels. A sidebar não gerencia foco. Elementos animados começam invisíveis e dependem de IntersectionObserver. Usuários de teclado/leitor de tela ou com falha de script podem não concluir tarefas.</w:t>
-      </w:r>
-    </w:p>
-    <w:p>
-      <w:pPr>
-        <w:pStyle w:val="Detail"/>
-      </w:pPr>
-      <w:r>
-        <w:rPr>
-          <w:b/>
-        </w:rPr>
-        <w:t xml:space="preserve">Controles existentes: </w:t>
-      </w:r>
-      <w:r>
-        <w:t xml:space="preserve">Há labels, alguns aria-labels, Escape para fechar menu e estilos responsivos.</w:t>
-      </w:r>
-    </w:p>
-    <w:p>
-      <w:pPr>
-        <w:pStyle w:val="Detail"/>
-      </w:pPr>
-      <w:r>
-        <w:rPr>
-          <w:b/>
-        </w:rPr>
-        <w:t xml:space="preserve">Resposta recomendada: </w:t>
-      </w:r>
-      <w:r>
-        <w:t xml:space="preserve">Mitigar: manter controles focáveis, dar nomes e estados acessíveis, gerir foco e visibilidade; oferecer conteúdo visível quando animações falharem e respeitar movimento reduzido. Testar os fluxos com teclado e leitor de tela.</w:t>
-      </w:r>
-    </w:p>
-    <w:p>
-      <w:pPr>
-        <w:pStyle w:val="Detail"/>
-      </w:pPr>
-      <w:r>
-        <w:rPr>
-          <w:b/>
-        </w:rPr>
-        <w:t xml:space="preserve">Contingência: </w:t>
-      </w:r>
-      <w:r>
-        <w:t xml:space="preserve">Disponibilizar apoio de atendimento e corrigir primeiro os bloqueios de cadastro e reserva.</w:t>
-      </w:r>
-    </w:p>
-    <w:p>
-      <w:pPr>
-        <w:pStyle w:val="Detail"/>
-      </w:pPr>
-      <w:r>
-        <w:rPr>
-          <w:b/>
-        </w:rPr>
-        <w:t xml:space="preserve">Monitoramento e gatilho: </w:t>
-      </w:r>
-      <w:r>
-        <w:t xml:space="preserve">A cada versão: concluir cadastro, reserva, avaliação e administração sem mouse; verificar zoom de 200% e celular. Qualquer tarefa essencial impossível bloqueia a entrega.</w:t>
-      </w:r>
-    </w:p>
-    <w:p>
-      <w:pPr>
-        <w:pStyle w:val="Detail"/>
-      </w:pPr>
-      <w:r>
-        <w:rPr>
-          <w:b/>
-        </w:rPr>
-        <w:t xml:space="preserve">Responsável / prazo: </w:t>
-      </w:r>
-      <w:r>
-        <w:t xml:space="preserve">Frontend e qualidade / Próxima entrega de interface.</w:t>
-      </w:r>
-    </w:p>
-    <w:p>
-      <w:pPr>
-        <w:pStyle w:val="Detail"/>
-      </w:pPr>
-      <w:r>
-        <w:rPr>
-          <w:b/>
-        </w:rPr>
-        <w:t xml:space="preserve">Referências locais: </w:t>
-      </w:r>
-      <w:r>
-        <w:t xml:space="preserve">css/style.css; css/barbeiros.css; comentarios.html; js/sidebar.js; js/animations.js.</w:t>
-      </w:r>
-    </w:p>
-    <w:p>
-      <w:pPr>
-        <w:pStyle w:val="Heading2"/>
-      </w:pPr>
-      <w:r>
-        <w:t xml:space="preserve">R16 • Incidentes detectados tarde e suporte sem diagnóstico</w:t>
-      </w:r>
-    </w:p>
-    <w:p>
-      <w:pPr>
-        <w:pStyle w:val="Detail"/>
-      </w:pPr>
-      <w:r>
-        <w:rPr>
-          <w:b/>
-        </w:rPr>
-        <w:t xml:space="preserve">Classificação: </w:t>
-      </w:r>
-      <w:r>
-        <w:t xml:space="preserve">Operação | P 3 × I 4 = 12 | Nível 3/5 — Moderado.</w:t>
-      </w:r>
-    </w:p>
-    <w:p>
-      <w:pPr>
-        <w:pStyle w:val="Detail"/>
-      </w:pPr>
-      <w:r>
-        <w:rPr>
-          <w:b/>
-        </w:rPr>
-        <w:t xml:space="preserve">Evidência e análise: </w:t>
-      </w:r>
-      <w:r>
-        <w:t xml:space="preserve">Controles operacionais não evidenciados no repositório. Existe /api/health, mas não há configuração de alertas ou registro estruturado de requisições, latência e correlação. Erros 500 registram principalmente código/nome. Não há fluxo de recuperação/troca de senha para o usuário. Falhas e perda de acesso podem depender de intervenção manual.</w:t>
-      </w:r>
-    </w:p>
-    <w:p>
-      <w:pPr>
-        <w:pStyle w:val="Detail"/>
-      </w:pPr>
-      <w:r>
-        <w:rPr>
-          <w:b/>
-        </w:rPr>
-        <w:t xml:space="preserve">Controles existentes: </w:t>
-      </w:r>
-      <w:r>
-        <w:t xml:space="preserve">Endpoint de saúde consulta o banco; logs básicos e encerramento do servidor por sinais.</w:t>
-      </w:r>
-    </w:p>
-    <w:p>
-      <w:pPr>
-        <w:pStyle w:val="Detail"/>
-      </w:pPr>
-      <w:r>
-        <w:rPr>
-          <w:b/>
-        </w:rPr>
-        <w:t xml:space="preserve">Resposta recomendada: </w:t>
-      </w:r>
-      <w:r>
-        <w:t xml:space="preserve">Mitigar: implantar monitoramento externo, logs com correlação sem segredos e roteiro de incidentes. Implementar recuperação segura de acesso com token temporário, uso único e revogação de sessões quando cabível.</w:t>
-      </w:r>
-    </w:p>
-    <w:p>
-      <w:pPr>
-        <w:pStyle w:val="Detail"/>
-      </w:pPr>
-      <w:r>
-        <w:rPr>
-          <w:b/>
-        </w:rPr>
-        <w:t xml:space="preserve">Contingência: </w:t>
-      </w:r>
-      <w:r>
-        <w:t xml:space="preserve">Designar responsável de plantão, seguir diagnóstico API/banco e validar identidade antes de recuperar uma conta.</w:t>
-      </w:r>
-    </w:p>
-    <w:p>
-      <w:pPr>
-        <w:pStyle w:val="Detail"/>
-      </w:pPr>
-      <w:r>
-        <w:rPr>
-          <w:b/>
-        </w:rPr>
-        <w:t xml:space="preserve">Monitoramento e gatilho: </w:t>
-      </w:r>
-      <w:r>
-        <w:t xml:space="preserve">Contínuo: alertar após 2 falhas de saúde ou erros 5xx acima de 1% por 5 minutos. Mensalmente: simular indisponibilidade e perda de senha e medir tempo de resposta.</w:t>
-      </w:r>
-    </w:p>
-    <w:p>
-      <w:pPr>
-        <w:pStyle w:val="Detail"/>
-      </w:pPr>
-      <w:r>
-        <w:rPr>
-          <w:b/>
-        </w:rPr>
-        <w:t xml:space="preserve">Responsável / prazo: </w:t>
-      </w:r>
-      <w:r>
-        <w:t xml:space="preserve">Infraestrutura, backend e atendimento / Antes da operação pública.</w:t>
-      </w:r>
-    </w:p>
-    <w:p>
-      <w:pPr>
-        <w:pStyle w:val="Detail"/>
-      </w:pPr>
-      <w:r>
-        <w:rPr>
-          <w:b/>
-        </w:rPr>
-        <w:t xml:space="preserve">Referências locais: </w:t>
-      </w:r>
-      <w:r>
-        <w:t xml:space="preserve">backend/app.js: /api/health e middleware de erro; backend/server.js; js/auth.js; auth.html.</w:t>
-      </w:r>
-    </w:p>
-    <w:p>
-      <w:r>
-        <w:br w:type="page"/>
-      </w:r>
-    </w:p>
-    <w:p>
-      <w:pPr>
-        <w:pStyle w:val="Heading1"/>
-      </w:pPr>
-      <w:r>
-        <w:t xml:space="preserve">5. Análise e resposta por risco — continuação</w:t>
-      </w:r>
-    </w:p>
-    <w:p>
-      <w:pPr>
-        <w:pStyle w:val="Heading2"/>
-      </w:pPr>
-      <w:r>
-        <w:t xml:space="preserve">R17 • Abuso de reservas e sobrecarga de moderação</w:t>
-      </w:r>
-    </w:p>
-    <w:p>
-      <w:pPr>
-        <w:pStyle w:val="Detail"/>
-      </w:pPr>
-      <w:r>
-        <w:rPr>
-          <w:b/>
-        </w:rPr>
-        <w:t xml:space="preserve">Classificação: </w:t>
-      </w:r>
-      <w:r>
-        <w:t xml:space="preserve">Operação e reputação | P 3 × I 3 = 9 | Nível 3/5 — Moderado.</w:t>
-      </w:r>
-    </w:p>
-    <w:p>
-      <w:pPr>
-        <w:pStyle w:val="Detail"/>
-      </w:pPr>
-      <w:r>
-        <w:rPr>
-          <w:b/>
-        </w:rPr>
-        <w:t xml:space="preserve">Evidência e análise: </w:t>
-      </w:r>
-      <w:r>
-        <w:t xml:space="preserve">Ausência de limites específicos observada. Comentários exigem login, mas não atendimento prévio nem limite por cliente; reservas e fila não têm quotas por usuário. Um usuário pode ocupar diversos horários ou enviar muitas avaliações, consumindo capacidade e tempo de moderação.</w:t>
-      </w:r>
-    </w:p>
-    <w:p>
-      <w:pPr>
-        <w:pStyle w:val="Detail"/>
-      </w:pPr>
-      <w:r>
-        <w:rPr>
-          <w:b/>
-        </w:rPr>
-        <w:t xml:space="preserve">Controles existentes: </w:t>
-      </w:r>
-      <w:r>
-        <w:t xml:space="preserve">Moderação antes de publicar, validação de nota/texto e controle de conflitos de horário.</w:t>
-      </w:r>
-    </w:p>
-    <w:p>
-      <w:pPr>
-        <w:pStyle w:val="Detail"/>
-      </w:pPr>
-      <w:r>
-        <w:rPr>
-          <w:b/>
-        </w:rPr>
-        <w:t xml:space="preserve">Resposta recomendada: </w:t>
-      </w:r>
-      <w:r>
-        <w:t xml:space="preserve">Mitigar: acordar limites de reservas futuras e comentários, aplicar limitação de requisições por usuário e regra de avaliação vinculada a atendimento se fizer sentido para o negócio.</w:t>
-      </w:r>
-    </w:p>
-    <w:p>
-      <w:pPr>
-        <w:pStyle w:val="Detail"/>
-      </w:pPr>
-      <w:r>
-        <w:rPr>
-          <w:b/>
-        </w:rPr>
-        <w:t xml:space="preserve">Contingência: </w:t>
-      </w:r>
-      <w:r>
-        <w:t xml:space="preserve">Revisar atividade suspeita, revogar sessões e cancelar registros abusivos com justificativa e possibilidade de revisão.</w:t>
-      </w:r>
-    </w:p>
-    <w:p>
-      <w:pPr>
-        <w:pStyle w:val="Detail"/>
-      </w:pPr>
-      <w:r>
-        <w:rPr>
-          <w:b/>
-        </w:rPr>
-        <w:t xml:space="preserve">Monitoramento e gatilho: </w:t>
-      </w:r>
-      <w:r>
-        <w:t xml:space="preserve">Diariamente: alertar por mais de 5 reservas futuras ou 10 comentários de um usuário em 24 horas; revisar esses limiares após medir uso legítimo. Acompanhar pendências de moderação acima de 48 horas.</w:t>
-      </w:r>
-    </w:p>
-    <w:p>
-      <w:pPr>
-        <w:pStyle w:val="Detail"/>
-      </w:pPr>
-      <w:r>
-        <w:rPr>
-          <w:b/>
-        </w:rPr>
-        <w:t xml:space="preserve">Responsável / prazo: </w:t>
-      </w:r>
-      <w:r>
-        <w:t xml:space="preserve">Backend e administrador / Primeiro ciclo de melhoria operacional.</w:t>
-      </w:r>
-    </w:p>
-    <w:p>
-      <w:pPr>
-        <w:pStyle w:val="Detail"/>
-      </w:pPr>
-      <w:r>
-        <w:rPr>
-          <w:b/>
-        </w:rPr>
-        <w:t xml:space="preserve">Referências locais: </w:t>
-      </w:r>
-      <w:r>
-        <w:t xml:space="preserve">backend/app.js: POST /api/agendamentos, /api/waitlist e /api/comments; js/app.js: saveComment.</w:t>
-      </w:r>
-    </w:p>
-    <w:p>
-      <w:pPr>
-        <w:pStyle w:val="Heading2"/>
-      </w:pPr>
-      <w:r>
-        <w:t xml:space="preserve">R18 • Manutenção difícil e dependências sem rotina de revisão</w:t>
-      </w:r>
-    </w:p>
-    <w:p>
-      <w:pPr>
-        <w:pStyle w:val="Detail"/>
-      </w:pPr>
-      <w:r>
-        <w:rPr>
-          <w:b/>
-        </w:rPr>
-        <w:t xml:space="preserve">Classificação: </w:t>
-      </w:r>
-      <w:r>
-        <w:t xml:space="preserve">Evolução e prazo | P 3 × I 3 = 9 | Nível 3/5 — Moderado.</w:t>
-      </w:r>
-    </w:p>
-    <w:p>
-      <w:pPr>
-        <w:pStyle w:val="Detail"/>
-      </w:pPr>
-      <w:r>
-        <w:rPr>
-          <w:b/>
-        </w:rPr>
-        <w:t xml:space="preserve">Evidência e análise: </w:t>
-      </w:r>
-      <w:r>
-        <w:t xml:space="preserve">Acoplamento e ausência de automação observados; nenhuma vulnerabilidade específica confirmada. js/app.js concentra 1.739 linhas e vários domínios. Há tela/script legados de barbeiros, CSS duplicado e diferenças entre documentação e backend. O workflow não revisa dependências. Mudanças podem gerar retrabalho, regressões e esforço de manutenção não previsto.</w:t>
-      </w:r>
-    </w:p>
-    <w:p>
-      <w:pPr>
-        <w:pStyle w:val="Detail"/>
-      </w:pPr>
-      <w:r>
-        <w:rPr>
-          <w:b/>
-        </w:rPr>
-        <w:t xml:space="preserve">Controles existentes: </w:t>
-      </w:r>
-      <w:r>
-        <w:t xml:space="preserve">Módulo REST separado, lockfile e documentação técnica. O lockfile fixa Express 5.2.1 e pg 8.23.0 na versão analisada.</w:t>
-      </w:r>
-    </w:p>
-    <w:p>
-      <w:pPr>
-        <w:pStyle w:val="Detail"/>
-      </w:pPr>
-      <w:r>
-        <w:rPr>
-          <w:b/>
-        </w:rPr>
-        <w:t xml:space="preserve">Resposta recomendada: </w:t>
-      </w:r>
-      <w:r>
-        <w:t xml:space="preserve">Mitigar: dividir módulos por funcionalidade, remover legado após validar referências, alinhar documentação, instalar por lockfile e revisar dependências em rotina definida; reservar capacidade de manutenção no planejamento.</w:t>
-      </w:r>
-    </w:p>
-    <w:p>
-      <w:pPr>
-        <w:pStyle w:val="Detail"/>
-      </w:pPr>
-      <w:r>
-        <w:rPr>
-          <w:b/>
-        </w:rPr>
-        <w:t xml:space="preserve">Contingência: </w:t>
-      </w:r>
-      <w:r>
-        <w:t xml:space="preserve">Reverter atualização problemática, fixar versão validada e priorizar correção conforme impacto comprovado.</w:t>
-      </w:r>
-    </w:p>
-    <w:p>
-      <w:pPr>
-        <w:pStyle w:val="Detail"/>
-      </w:pPr>
-      <w:r>
-        <w:rPr>
-          <w:b/>
-        </w:rPr>
-        <w:t xml:space="preserve">Monitoramento e gatilho: </w:t>
-      </w:r>
-      <w:r>
-        <w:t xml:space="preserve">Mensalmente: revisar dependências, documentação e código sem uso. A cada entrega: registrar retrabalho e falhas reabertas; investigar qualquer alerta de segurança aplicável ou regressão repetida.</w:t>
-      </w:r>
-    </w:p>
-    <w:p>
-      <w:pPr>
-        <w:pStyle w:val="Detail"/>
-      </w:pPr>
-      <w:r>
-        <w:rPr>
-          <w:b/>
-        </w:rPr>
-        <w:t xml:space="preserve">Responsável / prazo: </w:t>
-      </w:r>
-      <w:r>
-        <w:t xml:space="preserve">Liderança técnica e desenvolvimento / Plano de evolução de até 60 dias.</w:t>
-      </w:r>
-    </w:p>
-    <w:p>
-      <w:pPr>
-        <w:pStyle w:val="Detail"/>
-      </w:pPr>
-      <w:r>
-        <w:rPr>
-          <w:b/>
-        </w:rPr>
-        <w:t xml:space="preserve">Referências locais: </w:t>
-      </w:r>
-      <w:r>
-        <w:t xml:space="preserve">js/app.js; js/barbeiros.js; barbeiros.html; css/*.css; README.md; package.json; package-lock.json.</w:t>
-      </w:r>
-    </w:p>
-    <w:p>
-      <w:r>
-        <w:br w:type="page"/>
-      </w:r>
-    </w:p>
-    <w:p>
-      <w:pPr>
-        <w:pStyle w:val="Heading1"/>
-      </w:pPr>
-      <w:r>
         <w:t xml:space="preserve">6. Plano de execução e acompanhamento</w:t>
       </w:r>
     </w:p>
@@ -5616,7 +5616,7 @@
         <w:pStyle w:val="Normal"/>
       </w:pPr>
       <w:r>
-        <w:t xml:space="preserve">As janelas abaixo são propostas a partir da adoção deste plano. Quando um risco indicar “antes de operar/publicar”, essa condição prevalece sobre a janela em dias.</w:t>
+        <w:t xml:space="preserve">As janelas abaixo são propostas preventivas a partir da adoção do plano, sujeitas à confirmação da aplicabilidade de cada risco. Condições como “antes de operar/publicar” prevalecem sobre os prazos em dias. Verificar controles já previstos antes de definir ações adicionais.</w:t>
       </w:r>
     </w:p>
     <w:tbl>
@@ -5896,7 +5896,7 @@
         <w:pStyle w:val="Normal"/>
       </w:pPr>
       <w:r>
-        <w:t xml:space="preserve">Semanalmente: a liderança técnica revisa os riscos altos/críticos, as ações vencidas e os resultados das correções. Reavaliar probabilidade e impacto quando houver evidência nova, mudança de hospedagem, volume ou regra de negócio.</w:t>
+        <w:t xml:space="preserve">Semanalmente: a liderança técnica revisará riscos prioritários, ações vencidas e resultados das medidas preventivas. Reavaliar probabilidade e impacto diante de novas informações sobre hospedagem, volume, controles ou regras de negócio.</w:t>
       </w:r>
     </w:p>
     <w:p>
@@ -5928,7 +5928,7 @@
         <w:pStyle w:val="Normal"/>
       </w:pPr>
       <w:r>
-        <w:t xml:space="preserve">ID do risco; responsável nominal; estado (aberto, em tratamento, monitorando ou encerrado); ação; prazo; indicador observado; ocorrência do gatilho; evidência da correção; data de revisão; P/I/nível residual; justificativa de aceitação, quando aplicável. Não incluir senhas, tokens ou dados pessoais desnecessários nos registros.</w:t>
+        <w:t xml:space="preserve">ID do risco; responsável nominal; estado (potencial a validar, em tratamento, monitorando, não aplicável ou encerrado); ação; prazo; indicador; gatilho; evidência de eficácia do controle; data de revisão; P/I/nível residual; justificativa de aceitação ou não aplicabilidade. Não incluir segredos ou dados pessoais desnecessários.</w:t>
       </w:r>
     </w:p>
     <w:p>
@@ -5941,7 +5941,7 @@
         <w:pStyle w:val="Heading1"/>
       </w:pPr>
       <w:r>
-        <w:t xml:space="preserve">7. Inventário e rastreabilidade</w:t>
+        <w:t xml:space="preserve">7. Premissas e validação da futura implantação</w:t>
       </w:r>
     </w:p>
     <w:p>
@@ -5949,7 +5949,7 @@
         <w:pStyle w:val="Normal"/>
       </w:pPr>
       <w:r>
-        <w:t xml:space="preserve">Inventário de 35 arquivos disponíveis na revisão. Nos riscos, referências iniciadas por js/, css/ ou nomes de páginas são relativas a BarberApp/BarberApp/. As demais são relativas à raiz do repositório.</w:t>
+        <w:t xml:space="preserve">As áreas abaixo orientam a coleta de informações sobre a solução que será implantada. Não representam um inventário de arquivos revisados nem evidências de problemas existentes.</w:t>
       </w:r>
     </w:p>
     <w:tbl>
@@ -6014,7 +6014,7 @@
                 <w:b/>
                 <w:color w:val="FFFFFF"/>
               </w:rPr>
-              <w:t>Arquivos examinados</w:t>
+              <w:t>Informações a confirmar</w:t>
             </w:r>
           </w:p>
         </w:tc>
@@ -6053,7 +6053,7 @@
               <w:rPr>
                 <w:sz w:val="18"/>
               </w:rPr>
-              <w:t>.github/workflows/deploy.yml; .gitignore; package-lock.json; package.json; README.md</w:t>
+              <w:t>Modelo de hospedagem, integração entre interface e serviços, configuração de ambientes e processo de publicação.</w:t>
             </w:r>
           </w:p>
         </w:tc>
@@ -6092,7 +6092,7 @@
               <w:rPr>
                 <w:sz w:val="18"/>
               </w:rPr>
-              <w:t>backend/admin.js; backend/app.js; backend/bookings.js; backend/db.js; backend/migrate.js; backend/README.md; backend/schema.sql; backend/security.js; backend/server.js</w:t>
+              <w:t>Arquitetura dos serviços, regras da agenda, autenticação, permissões e estratégia de persistência.</w:t>
             </w:r>
           </w:p>
         </w:tc>
@@ -6131,7 +6131,7 @@
               <w:rPr>
                 <w:sz w:val="18"/>
               </w:rPr>
-              <w:t>backend/test/integration.test.js; backend/test/security.test.js</w:t>
+              <w:t>Critérios de aceite e cobertura de testes de integração, segurança, concorrência e recuperação.</w:t>
             </w:r>
           </w:p>
         </w:tc>
@@ -6170,7 +6170,7 @@
               <w:rPr>
                 <w:sz w:val="18"/>
               </w:rPr>
-              <w:t>admin.html; agendamentos.html; auth.html; barbeiros.html; comentarios.html; index.html; LEIA-ME.txt; sobre.html</w:t>
+              <w:t>Jornadas de cadastro, reserva, cancelamento, fila, avaliação e administração; orientações de uso.</w:t>
             </w:r>
           </w:p>
         </w:tc>
@@ -6209,7 +6209,7 @@
               <w:rPr>
                 <w:sz w:val="18"/>
               </w:rPr>
-              <w:t>animations.js; api.js; app.js; auth.js; barbeiros.js; config.js; sidebar.js</w:t>
+              <w:t>Tratamento de erros, comunicação com os serviços, gestão de sessões e sincronização da disponibilidade.</w:t>
             </w:r>
           </w:p>
         </w:tc>
@@ -6248,7 +6248,7 @@
               <w:rPr>
                 <w:sz w:val="18"/>
               </w:rPr>
-              <w:t>agendamentos.css; barbeiros.css; style.css</w:t>
+              <w:t>Acessibilidade, responsividade, navegação por teclado e comportamento sem animações.</w:t>
             </w:r>
           </w:p>
         </w:tc>
@@ -6287,7 +6287,7 @@
               <w:rPr>
                 <w:sz w:val="18"/>
               </w:rPr>
-              <w:t>BarberApp/BarberApp/resources/barbearia.jpg</w:t>
+              <w:t>Política de armazenamento, entrega, tamanho e uso de imagens na solução futura.</w:t>
             </w:r>
           </w:p>
         </w:tc>
@@ -6298,7 +6298,7 @@
         <w:pStyle w:val="Heading2"/>
       </w:pPr>
       <w:r>
-        <w:t xml:space="preserve">Informações que devem ser confirmadas na próxima revisão</w:t>
+        <w:t xml:space="preserve">Informações a confirmar antes da implantação</w:t>
       </w:r>
     </w:p>
     <w:p>
@@ -6306,7 +6306,7 @@
         <w:pStyle w:val="Normal"/>
       </w:pPr>
       <w:r>
-        <w:t xml:space="preserve">Hospedagem real e domínio da API; existência de HTTPS/proxy e controles externos; rotina de backup e retenção; volume de usuários; metas de disponibilidade; nomes dos responsáveis; calendário oficial; regras de cancelamento/fila e significado do indicador Faturado. Essas informações podem alterar a classificação inicial.</w:t>
+        <w:t xml:space="preserve">Hospedagem, comunicação segura, recuperação de dados, volume esperado, metas de disponibilidade, responsáveis, calendário, regras de fila/cancelamento e significado dos indicadores. Essas definições deverão fundamentar a revisão das notas preliminares.</w:t>
       </w:r>
     </w:p>
     <w:p>

</xml_diff>